<commit_message>
Move Table of Abbreviations to Section 2 at top of design document
</commit_message>
<xml_diff>
--- a/DetailedDesignDocument.docx
+++ b/DetailedDesignDocument.docx
@@ -625,13 +625,939 @@
     <w:p>
       <w:pPr>
         <w:pStyle w:val="Heading1"/>
+        <w:spacing w:before="280" w:after="120"/>
+      </w:pPr>
+      <w:r>
+        <w:rPr>
+          <w:color w:val="1E3A8A"/>
+        </w:rPr>
+        <w:t>2. Table of Abbreviations &amp; Core Terminology</w:t>
+      </w:r>
+    </w:p>
+    <w:tbl>
+      <w:tblPr>
+        <w:tblW w:type="auto" w:w="0"/>
+        <w:jc w:val="center"/>
+        <w:tblLayout w:type="fixed"/>
+        <w:tblLook w:firstColumn="1" w:firstRow="1" w:lastColumn="0" w:lastRow="0" w:noHBand="0" w:noVBand="1" w:val="04A0"/>
+      </w:tblPr>
+      <w:tblGrid>
+        <w:gridCol w:w="3120"/>
+        <w:gridCol w:w="3120"/>
+        <w:gridCol w:w="3120"/>
+      </w:tblGrid>
+      <w:tr>
+        <w:tc>
+          <w:tcPr>
+            <w:tcW w:type="dxa" w:w="2016"/>
+            <w:shd w:fill="1E3A8A"/>
+            <w:tcMar>
+              <w:top w:w="120" w:type="dxa"/>
+              <w:bottom w:w="120" w:type="dxa"/>
+              <w:left w:w="140" w:type="dxa"/>
+              <w:right w:w="140" w:type="dxa"/>
+            </w:tcMar>
+          </w:tcPr>
+          <w:p>
+            <w:pPr>
+              <w:jc w:val="left"/>
+            </w:pPr>
+            <w:r>
+              <w:rPr>
+                <w:rFonts w:ascii="Calibri" w:hAnsi="Calibri"/>
+                <w:b/>
+                <w:color w:val="FFFFFF"/>
+                <w:sz w:val="20"/>
+              </w:rPr>
+              <w:t>Abbreviation</w:t>
+            </w:r>
+          </w:p>
+        </w:tc>
+        <w:tc>
+          <w:tcPr>
+            <w:tcW w:type="dxa" w:w="3168"/>
+            <w:shd w:fill="1E3A8A"/>
+            <w:tcMar>
+              <w:top w:w="120" w:type="dxa"/>
+              <w:bottom w:w="120" w:type="dxa"/>
+              <w:left w:w="140" w:type="dxa"/>
+              <w:right w:w="140" w:type="dxa"/>
+            </w:tcMar>
+          </w:tcPr>
+          <w:p>
+            <w:pPr>
+              <w:jc w:val="left"/>
+            </w:pPr>
+            <w:r>
+              <w:rPr>
+                <w:rFonts w:ascii="Calibri" w:hAnsi="Calibri"/>
+                <w:b/>
+                <w:color w:val="FFFFFF"/>
+                <w:sz w:val="20"/>
+              </w:rPr>
+              <w:t>Full Term / Agency</w:t>
+            </w:r>
+          </w:p>
+        </w:tc>
+        <w:tc>
+          <w:tcPr>
+            <w:tcW w:type="dxa" w:w="4176"/>
+            <w:shd w:fill="1E3A8A"/>
+            <w:tcMar>
+              <w:top w:w="120" w:type="dxa"/>
+              <w:bottom w:w="120" w:type="dxa"/>
+              <w:left w:w="140" w:type="dxa"/>
+              <w:right w:w="140" w:type="dxa"/>
+            </w:tcMar>
+          </w:tcPr>
+          <w:p>
+            <w:pPr>
+              <w:jc w:val="left"/>
+            </w:pPr>
+            <w:r>
+              <w:rPr>
+                <w:rFonts w:ascii="Calibri" w:hAnsi="Calibri"/>
+                <w:b/>
+                <w:color w:val="FFFFFF"/>
+                <w:sz w:val="20"/>
+              </w:rPr>
+              <w:t>Definition &amp; Regulatory Role</w:t>
+            </w:r>
+          </w:p>
+        </w:tc>
+      </w:tr>
+      <w:tr>
+        <w:tc>
+          <w:tcPr>
+            <w:tcW w:type="dxa" w:w="2016"/>
+            <w:shd w:fill="FFFFFF"/>
+            <w:tcMar>
+              <w:top w:w="90" w:type="dxa"/>
+              <w:bottom w:w="90" w:type="dxa"/>
+              <w:left w:w="140" w:type="dxa"/>
+              <w:right w:w="140" w:type="dxa"/>
+            </w:tcMar>
+          </w:tcPr>
+          <w:p>
+            <w:r>
+              <w:rPr>
+                <w:rFonts w:ascii="Calibri" w:hAnsi="Calibri"/>
+                <w:color w:val="1E293B"/>
+                <w:sz w:val="19"/>
+              </w:rPr>
+              <w:t>AC / DC</w:t>
+            </w:r>
+          </w:p>
+        </w:tc>
+        <w:tc>
+          <w:tcPr>
+            <w:tcW w:type="dxa" w:w="3168"/>
+            <w:shd w:fill="FFFFFF"/>
+            <w:tcMar>
+              <w:top w:w="90" w:type="dxa"/>
+              <w:bottom w:w="90" w:type="dxa"/>
+              <w:left w:w="140" w:type="dxa"/>
+              <w:right w:w="140" w:type="dxa"/>
+            </w:tcMar>
+          </w:tcPr>
+          <w:p>
+            <w:r>
+              <w:rPr>
+                <w:rFonts w:ascii="Calibri" w:hAnsi="Calibri"/>
+                <w:color w:val="1E293B"/>
+                <w:sz w:val="19"/>
+              </w:rPr>
+              <w:t>Alternating / Direct Current</w:t>
+            </w:r>
+          </w:p>
+        </w:tc>
+        <w:tc>
+          <w:tcPr>
+            <w:tcW w:type="dxa" w:w="4176"/>
+            <w:shd w:fill="FFFFFF"/>
+            <w:tcMar>
+              <w:top w:w="90" w:type="dxa"/>
+              <w:bottom w:w="90" w:type="dxa"/>
+              <w:left w:w="140" w:type="dxa"/>
+              <w:right w:w="140" w:type="dxa"/>
+            </w:tcMar>
+          </w:tcPr>
+          <w:p>
+            <w:r>
+              <w:rPr>
+                <w:rFonts w:ascii="Calibri" w:hAnsi="Calibri"/>
+                <w:color w:val="1E293B"/>
+                <w:sz w:val="19"/>
+              </w:rPr>
+              <w:t>DC is raw solar cell output; AC is usable building and grid electricity.</w:t>
+            </w:r>
+          </w:p>
+        </w:tc>
+      </w:tr>
+      <w:tr>
+        <w:tc>
+          <w:tcPr>
+            <w:tcW w:type="dxa" w:w="2016"/>
+            <w:shd w:fill="F8FAFC"/>
+            <w:tcMar>
+              <w:top w:w="90" w:type="dxa"/>
+              <w:bottom w:w="90" w:type="dxa"/>
+              <w:left w:w="140" w:type="dxa"/>
+              <w:right w:w="140" w:type="dxa"/>
+            </w:tcMar>
+          </w:tcPr>
+          <w:p>
+            <w:r>
+              <w:rPr>
+                <w:rFonts w:ascii="Calibri" w:hAnsi="Calibri"/>
+                <w:color w:val="1E293B"/>
+                <w:sz w:val="19"/>
+              </w:rPr>
+              <w:t>BBox</w:t>
+            </w:r>
+          </w:p>
+        </w:tc>
+        <w:tc>
+          <w:tcPr>
+            <w:tcW w:type="dxa" w:w="3168"/>
+            <w:shd w:fill="F8FAFC"/>
+            <w:tcMar>
+              <w:top w:w="90" w:type="dxa"/>
+              <w:bottom w:w="90" w:type="dxa"/>
+              <w:left w:w="140" w:type="dxa"/>
+              <w:right w:w="140" w:type="dxa"/>
+            </w:tcMar>
+          </w:tcPr>
+          <w:p>
+            <w:r>
+              <w:rPr>
+                <w:rFonts w:ascii="Calibri" w:hAnsi="Calibri"/>
+                <w:color w:val="1E293B"/>
+                <w:sz w:val="19"/>
+              </w:rPr>
+              <w:t>Geographic Bounding Box</w:t>
+            </w:r>
+          </w:p>
+        </w:tc>
+        <w:tc>
+          <w:tcPr>
+            <w:tcW w:type="dxa" w:w="4176"/>
+            <w:shd w:fill="F8FAFC"/>
+            <w:tcMar>
+              <w:top w:w="90" w:type="dxa"/>
+              <w:bottom w:w="90" w:type="dxa"/>
+              <w:left w:w="140" w:type="dxa"/>
+              <w:right w:w="140" w:type="dxa"/>
+            </w:tcMar>
+          </w:tcPr>
+          <w:p>
+            <w:r>
+              <w:rPr>
+                <w:rFonts w:ascii="Calibri" w:hAnsi="Calibri"/>
+                <w:color w:val="1E293B"/>
+                <w:sz w:val="19"/>
+              </w:rPr>
+              <w:t>Min/max latitude and longitude coordinates defining the spatial query boundary.</w:t>
+            </w:r>
+          </w:p>
+        </w:tc>
+      </w:tr>
+      <w:tr>
+        <w:tc>
+          <w:tcPr>
+            <w:tcW w:type="dxa" w:w="2016"/>
+            <w:shd w:fill="FFFFFF"/>
+            <w:tcMar>
+              <w:top w:w="90" w:type="dxa"/>
+              <w:bottom w:w="90" w:type="dxa"/>
+              <w:left w:w="140" w:type="dxa"/>
+              <w:right w:w="140" w:type="dxa"/>
+            </w:tcMar>
+          </w:tcPr>
+          <w:p>
+            <w:r>
+              <w:rPr>
+                <w:rFonts w:ascii="Calibri" w:hAnsi="Calibri"/>
+                <w:color w:val="1E293B"/>
+                <w:sz w:val="19"/>
+              </w:rPr>
+              <w:t>CDE</w:t>
+            </w:r>
+          </w:p>
+        </w:tc>
+        <w:tc>
+          <w:tcPr>
+            <w:tcW w:type="dxa" w:w="3168"/>
+            <w:shd w:fill="FFFFFF"/>
+            <w:tcMar>
+              <w:top w:w="90" w:type="dxa"/>
+              <w:bottom w:w="90" w:type="dxa"/>
+              <w:left w:w="140" w:type="dxa"/>
+              <w:right w:w="140" w:type="dxa"/>
+            </w:tcMar>
+          </w:tcPr>
+          <w:p>
+            <w:r>
+              <w:rPr>
+                <w:rFonts w:ascii="Calibri" w:hAnsi="Calibri"/>
+                <w:color w:val="1E293B"/>
+                <w:sz w:val="19"/>
+              </w:rPr>
+              <w:t>California Department of Education</w:t>
+            </w:r>
+          </w:p>
+        </w:tc>
+        <w:tc>
+          <w:tcPr>
+            <w:tcW w:type="dxa" w:w="4176"/>
+            <w:shd w:fill="FFFFFF"/>
+            <w:tcMar>
+              <w:top w:w="90" w:type="dxa"/>
+              <w:bottom w:w="90" w:type="dxa"/>
+              <w:left w:w="140" w:type="dxa"/>
+              <w:right w:w="140" w:type="dxa"/>
+            </w:tcMar>
+          </w:tcPr>
+          <w:p>
+            <w:r>
+              <w:rPr>
+                <w:rFonts w:ascii="Calibri" w:hAnsi="Calibri"/>
+                <w:color w:val="1E293B"/>
+                <w:sz w:val="19"/>
+              </w:rPr>
+              <w:t>State agency publishing California public school directories and enrollment records.</w:t>
+            </w:r>
+          </w:p>
+        </w:tc>
+      </w:tr>
+      <w:tr>
+        <w:tc>
+          <w:tcPr>
+            <w:tcW w:type="dxa" w:w="2016"/>
+            <w:shd w:fill="F8FAFC"/>
+            <w:tcMar>
+              <w:top w:w="90" w:type="dxa"/>
+              <w:bottom w:w="90" w:type="dxa"/>
+              <w:left w:w="140" w:type="dxa"/>
+              <w:right w:w="140" w:type="dxa"/>
+            </w:tcMar>
+          </w:tcPr>
+          <w:p>
+            <w:r>
+              <w:rPr>
+                <w:rFonts w:ascii="Calibri" w:hAnsi="Calibri"/>
+                <w:color w:val="1E293B"/>
+                <w:sz w:val="19"/>
+              </w:rPr>
+              <w:t>CRS / EPSG:4326</w:t>
+            </w:r>
+          </w:p>
+        </w:tc>
+        <w:tc>
+          <w:tcPr>
+            <w:tcW w:type="dxa" w:w="3168"/>
+            <w:shd w:fill="F8FAFC"/>
+            <w:tcMar>
+              <w:top w:w="90" w:type="dxa"/>
+              <w:bottom w:w="90" w:type="dxa"/>
+              <w:left w:w="140" w:type="dxa"/>
+              <w:right w:w="140" w:type="dxa"/>
+            </w:tcMar>
+          </w:tcPr>
+          <w:p>
+            <w:r>
+              <w:rPr>
+                <w:rFonts w:ascii="Calibri" w:hAnsi="Calibri"/>
+                <w:color w:val="1E293B"/>
+                <w:sz w:val="19"/>
+              </w:rPr>
+              <w:t>Coordinate Reference System</w:t>
+            </w:r>
+          </w:p>
+        </w:tc>
+        <w:tc>
+          <w:tcPr>
+            <w:tcW w:type="dxa" w:w="4176"/>
+            <w:shd w:fill="F8FAFC"/>
+            <w:tcMar>
+              <w:top w:w="90" w:type="dxa"/>
+              <w:bottom w:w="90" w:type="dxa"/>
+              <w:left w:w="140" w:type="dxa"/>
+              <w:right w:w="140" w:type="dxa"/>
+            </w:tcMar>
+          </w:tcPr>
+          <w:p>
+            <w:r>
+              <w:rPr>
+                <w:rFonts w:ascii="Calibri" w:hAnsi="Calibri"/>
+                <w:color w:val="1E293B"/>
+                <w:sz w:val="19"/>
+              </w:rPr>
+              <w:t>Global WGS 84 spherical coordinate reference system in decimal degrees.</w:t>
+            </w:r>
+          </w:p>
+        </w:tc>
+      </w:tr>
+      <w:tr>
+        <w:tc>
+          <w:tcPr>
+            <w:tcW w:type="dxa" w:w="2016"/>
+            <w:shd w:fill="FFFFFF"/>
+            <w:tcMar>
+              <w:top w:w="90" w:type="dxa"/>
+              <w:bottom w:w="90" w:type="dxa"/>
+              <w:left w:w="140" w:type="dxa"/>
+              <w:right w:w="140" w:type="dxa"/>
+            </w:tcMar>
+          </w:tcPr>
+          <w:p>
+            <w:r>
+              <w:rPr>
+                <w:rFonts w:ascii="Calibri" w:hAnsi="Calibri"/>
+                <w:color w:val="1E293B"/>
+                <w:sz w:val="19"/>
+              </w:rPr>
+              <w:t>EPA eGRID</w:t>
+            </w:r>
+          </w:p>
+        </w:tc>
+        <w:tc>
+          <w:tcPr>
+            <w:tcW w:type="dxa" w:w="3168"/>
+            <w:shd w:fill="FFFFFF"/>
+            <w:tcMar>
+              <w:top w:w="90" w:type="dxa"/>
+              <w:bottom w:w="90" w:type="dxa"/>
+              <w:left w:w="140" w:type="dxa"/>
+              <w:right w:w="140" w:type="dxa"/>
+            </w:tcMar>
+          </w:tcPr>
+          <w:p>
+            <w:r>
+              <w:rPr>
+                <w:rFonts w:ascii="Calibri" w:hAnsi="Calibri"/>
+                <w:color w:val="1E293B"/>
+                <w:sz w:val="19"/>
+              </w:rPr>
+              <w:t>Emissions &amp; Generation Resource Database</w:t>
+            </w:r>
+          </w:p>
+        </w:tc>
+        <w:tc>
+          <w:tcPr>
+            <w:tcW w:type="dxa" w:w="4176"/>
+            <w:shd w:fill="FFFFFF"/>
+            <w:tcMar>
+              <w:top w:w="90" w:type="dxa"/>
+              <w:bottom w:w="90" w:type="dxa"/>
+              <w:left w:w="140" w:type="dxa"/>
+              <w:right w:w="140" w:type="dxa"/>
+            </w:tcMar>
+          </w:tcPr>
+          <w:p>
+            <w:r>
+              <w:rPr>
+                <w:rFonts w:ascii="Calibri" w:hAnsi="Calibri"/>
+                <w:color w:val="1E293B"/>
+                <w:sz w:val="19"/>
+              </w:rPr>
+              <w:t>Federal EPA database tracking subregion greenhouse gas emission factors per kWh.</w:t>
+            </w:r>
+          </w:p>
+        </w:tc>
+      </w:tr>
+      <w:tr>
+        <w:tc>
+          <w:tcPr>
+            <w:tcW w:type="dxa" w:w="2016"/>
+            <w:shd w:fill="F8FAFC"/>
+            <w:tcMar>
+              <w:top w:w="90" w:type="dxa"/>
+              <w:bottom w:w="90" w:type="dxa"/>
+              <w:left w:w="140" w:type="dxa"/>
+              <w:right w:w="140" w:type="dxa"/>
+            </w:tcMar>
+          </w:tcPr>
+          <w:p>
+            <w:r>
+              <w:rPr>
+                <w:rFonts w:ascii="Calibri" w:hAnsi="Calibri"/>
+                <w:color w:val="1E293B"/>
+                <w:sz w:val="19"/>
+              </w:rPr>
+              <w:t>IRA Direct Pay</w:t>
+            </w:r>
+          </w:p>
+        </w:tc>
+        <w:tc>
+          <w:tcPr>
+            <w:tcW w:type="dxa" w:w="3168"/>
+            <w:shd w:fill="F8FAFC"/>
+            <w:tcMar>
+              <w:top w:w="90" w:type="dxa"/>
+              <w:bottom w:w="90" w:type="dxa"/>
+              <w:left w:w="140" w:type="dxa"/>
+              <w:right w:w="140" w:type="dxa"/>
+            </w:tcMar>
+          </w:tcPr>
+          <w:p>
+            <w:r>
+              <w:rPr>
+                <w:rFonts w:ascii="Calibri" w:hAnsi="Calibri"/>
+                <w:color w:val="1E293B"/>
+                <w:sz w:val="19"/>
+              </w:rPr>
+              <w:t>Inflation Reduction Act Section 6417</w:t>
+            </w:r>
+          </w:p>
+        </w:tc>
+        <w:tc>
+          <w:tcPr>
+            <w:tcW w:type="dxa" w:w="4176"/>
+            <w:shd w:fill="F8FAFC"/>
+            <w:tcMar>
+              <w:top w:w="90" w:type="dxa"/>
+              <w:bottom w:w="90" w:type="dxa"/>
+              <w:left w:w="140" w:type="dxa"/>
+              <w:right w:w="140" w:type="dxa"/>
+            </w:tcMar>
+          </w:tcPr>
+          <w:p>
+            <w:r>
+              <w:rPr>
+                <w:rFonts w:ascii="Calibri" w:hAnsi="Calibri"/>
+                <w:color w:val="1E293B"/>
+                <w:sz w:val="19"/>
+              </w:rPr>
+              <w:t>Statutory mechanism providing 30% to 50% IRS cash refunds to tax-exempt entities.</w:t>
+            </w:r>
+          </w:p>
+        </w:tc>
+      </w:tr>
+      <w:tr>
+        <w:tc>
+          <w:tcPr>
+            <w:tcW w:type="dxa" w:w="2016"/>
+            <w:shd w:fill="FFFFFF"/>
+            <w:tcMar>
+              <w:top w:w="90" w:type="dxa"/>
+              <w:bottom w:w="90" w:type="dxa"/>
+              <w:left w:w="140" w:type="dxa"/>
+              <w:right w:w="140" w:type="dxa"/>
+            </w:tcMar>
+          </w:tcPr>
+          <w:p>
+            <w:r>
+              <w:rPr>
+                <w:rFonts w:ascii="Calibri" w:hAnsi="Calibri"/>
+                <w:color w:val="1E293B"/>
+                <w:sz w:val="19"/>
+              </w:rPr>
+              <w:t>IRS Form 990-T</w:t>
+            </w:r>
+          </w:p>
+        </w:tc>
+        <w:tc>
+          <w:tcPr>
+            <w:tcW w:type="dxa" w:w="3168"/>
+            <w:shd w:fill="FFFFFF"/>
+            <w:tcMar>
+              <w:top w:w="90" w:type="dxa"/>
+              <w:bottom w:w="90" w:type="dxa"/>
+              <w:left w:w="140" w:type="dxa"/>
+              <w:right w:w="140" w:type="dxa"/>
+            </w:tcMar>
+          </w:tcPr>
+          <w:p>
+            <w:r>
+              <w:rPr>
+                <w:rFonts w:ascii="Calibri" w:hAnsi="Calibri"/>
+                <w:color w:val="1E293B"/>
+                <w:sz w:val="19"/>
+              </w:rPr>
+              <w:t>Tax-Exempt Return</w:t>
+            </w:r>
+          </w:p>
+        </w:tc>
+        <w:tc>
+          <w:tcPr>
+            <w:tcW w:type="dxa" w:w="4176"/>
+            <w:shd w:fill="FFFFFF"/>
+            <w:tcMar>
+              <w:top w:w="90" w:type="dxa"/>
+              <w:bottom w:w="90" w:type="dxa"/>
+              <w:left w:w="140" w:type="dxa"/>
+              <w:right w:w="140" w:type="dxa"/>
+            </w:tcMar>
+          </w:tcPr>
+          <w:p>
+            <w:r>
+              <w:rPr>
+                <w:rFonts w:ascii="Calibri" w:hAnsi="Calibri"/>
+                <w:color w:val="1E293B"/>
+                <w:sz w:val="19"/>
+              </w:rPr>
+              <w:t>Federal tax form filed by public school districts to claim clean energy Direct Pay.</w:t>
+            </w:r>
+          </w:p>
+        </w:tc>
+      </w:tr>
+      <w:tr>
+        <w:tc>
+          <w:tcPr>
+            <w:tcW w:type="dxa" w:w="2016"/>
+            <w:shd w:fill="F8FAFC"/>
+            <w:tcMar>
+              <w:top w:w="90" w:type="dxa"/>
+              <w:bottom w:w="90" w:type="dxa"/>
+              <w:left w:w="140" w:type="dxa"/>
+              <w:right w:w="140" w:type="dxa"/>
+            </w:tcMar>
+          </w:tcPr>
+          <w:p>
+            <w:r>
+              <w:rPr>
+                <w:rFonts w:ascii="Calibri" w:hAnsi="Calibri"/>
+                <w:color w:val="1E293B"/>
+                <w:sz w:val="19"/>
+              </w:rPr>
+              <w:t>NCES</w:t>
+            </w:r>
+          </w:p>
+        </w:tc>
+        <w:tc>
+          <w:tcPr>
+            <w:tcW w:type="dxa" w:w="3168"/>
+            <w:shd w:fill="F8FAFC"/>
+            <w:tcMar>
+              <w:top w:w="90" w:type="dxa"/>
+              <w:bottom w:w="90" w:type="dxa"/>
+              <w:left w:w="140" w:type="dxa"/>
+              <w:right w:w="140" w:type="dxa"/>
+            </w:tcMar>
+          </w:tcPr>
+          <w:p>
+            <w:r>
+              <w:rPr>
+                <w:rFonts w:ascii="Calibri" w:hAnsi="Calibri"/>
+                <w:color w:val="1E293B"/>
+                <w:sz w:val="19"/>
+              </w:rPr>
+              <w:t>National Center for Education Statistics</w:t>
+            </w:r>
+          </w:p>
+        </w:tc>
+        <w:tc>
+          <w:tcPr>
+            <w:tcW w:type="dxa" w:w="4176"/>
+            <w:shd w:fill="F8FAFC"/>
+            <w:tcMar>
+              <w:top w:w="90" w:type="dxa"/>
+              <w:bottom w:w="90" w:type="dxa"/>
+              <w:left w:w="140" w:type="dxa"/>
+              <w:right w:w="140" w:type="dxa"/>
+            </w:tcMar>
+          </w:tcPr>
+          <w:p>
+            <w:r>
+              <w:rPr>
+                <w:rFonts w:ascii="Calibri" w:hAnsi="Calibri"/>
+                <w:color w:val="1E293B"/>
+                <w:sz w:val="19"/>
+              </w:rPr>
+              <w:t>Federal agency maintaining locations and demographic data for ~100k U.S. schools.</w:t>
+            </w:r>
+          </w:p>
+        </w:tc>
+      </w:tr>
+      <w:tr>
+        <w:tc>
+          <w:tcPr>
+            <w:tcW w:type="dxa" w:w="2016"/>
+            <w:shd w:fill="FFFFFF"/>
+            <w:tcMar>
+              <w:top w:w="90" w:type="dxa"/>
+              <w:bottom w:w="90" w:type="dxa"/>
+              <w:left w:w="140" w:type="dxa"/>
+              <w:right w:w="140" w:type="dxa"/>
+            </w:tcMar>
+          </w:tcPr>
+          <w:p>
+            <w:r>
+              <w:rPr>
+                <w:rFonts w:ascii="Calibri" w:hAnsi="Calibri"/>
+                <w:color w:val="1E293B"/>
+                <w:sz w:val="19"/>
+              </w:rPr>
+              <w:t>NLR / NSRDB</w:t>
+            </w:r>
+          </w:p>
+        </w:tc>
+        <w:tc>
+          <w:tcPr>
+            <w:tcW w:type="dxa" w:w="3168"/>
+            <w:shd w:fill="FFFFFF"/>
+            <w:tcMar>
+              <w:top w:w="90" w:type="dxa"/>
+              <w:bottom w:w="90" w:type="dxa"/>
+              <w:left w:w="140" w:type="dxa"/>
+              <w:right w:w="140" w:type="dxa"/>
+            </w:tcMar>
+          </w:tcPr>
+          <w:p>
+            <w:r>
+              <w:rPr>
+                <w:rFonts w:ascii="Calibri" w:hAnsi="Calibri"/>
+                <w:color w:val="1E293B"/>
+                <w:sz w:val="19"/>
+              </w:rPr>
+              <w:t>National Laboratory of the Rockies</w:t>
+            </w:r>
+          </w:p>
+        </w:tc>
+        <w:tc>
+          <w:tcPr>
+            <w:tcW w:type="dxa" w:w="4176"/>
+            <w:shd w:fill="FFFFFF"/>
+            <w:tcMar>
+              <w:top w:w="90" w:type="dxa"/>
+              <w:bottom w:w="90" w:type="dxa"/>
+              <w:left w:w="140" w:type="dxa"/>
+              <w:right w:w="140" w:type="dxa"/>
+            </w:tcMar>
+          </w:tcPr>
+          <w:p>
+            <w:r>
+              <w:rPr>
+                <w:rFonts w:ascii="Calibri" w:hAnsi="Calibri"/>
+                <w:color w:val="1E293B"/>
+                <w:sz w:val="19"/>
+              </w:rPr>
+              <w:t>U.S. DOE lab (formerly NREL) and the 4km National Solar Radiation Database.</w:t>
+            </w:r>
+          </w:p>
+        </w:tc>
+      </w:tr>
+      <w:tr>
+        <w:tc>
+          <w:tcPr>
+            <w:tcW w:type="dxa" w:w="2016"/>
+            <w:shd w:fill="F8FAFC"/>
+            <w:tcMar>
+              <w:top w:w="90" w:type="dxa"/>
+              <w:bottom w:w="90" w:type="dxa"/>
+              <w:left w:w="140" w:type="dxa"/>
+              <w:right w:w="140" w:type="dxa"/>
+            </w:tcMar>
+          </w:tcPr>
+          <w:p>
+            <w:r>
+              <w:rPr>
+                <w:rFonts w:ascii="Calibri" w:hAnsi="Calibri"/>
+                <w:color w:val="1E293B"/>
+                <w:sz w:val="19"/>
+              </w:rPr>
+              <w:t>POA</w:t>
+            </w:r>
+          </w:p>
+        </w:tc>
+        <w:tc>
+          <w:tcPr>
+            <w:tcW w:type="dxa" w:w="3168"/>
+            <w:shd w:fill="F8FAFC"/>
+            <w:tcMar>
+              <w:top w:w="90" w:type="dxa"/>
+              <w:bottom w:w="90" w:type="dxa"/>
+              <w:left w:w="140" w:type="dxa"/>
+              <w:right w:w="140" w:type="dxa"/>
+            </w:tcMar>
+          </w:tcPr>
+          <w:p>
+            <w:r>
+              <w:rPr>
+                <w:rFonts w:ascii="Calibri" w:hAnsi="Calibri"/>
+                <w:color w:val="1E293B"/>
+                <w:sz w:val="19"/>
+              </w:rPr>
+              <w:t>Plane of Array</w:t>
+            </w:r>
+          </w:p>
+        </w:tc>
+        <w:tc>
+          <w:tcPr>
+            <w:tcW w:type="dxa" w:w="4176"/>
+            <w:shd w:fill="F8FAFC"/>
+            <w:tcMar>
+              <w:top w:w="90" w:type="dxa"/>
+              <w:bottom w:w="90" w:type="dxa"/>
+              <w:left w:w="140" w:type="dxa"/>
+              <w:right w:w="140" w:type="dxa"/>
+            </w:tcMar>
+          </w:tcPr>
+          <w:p>
+            <w:r>
+              <w:rPr>
+                <w:rFonts w:ascii="Calibri" w:hAnsi="Calibri"/>
+                <w:color w:val="1E293B"/>
+                <w:sz w:val="19"/>
+              </w:rPr>
+              <w:t>Solar irradiance striking tilted photovoltaic collector surfaces.</w:t>
+            </w:r>
+          </w:p>
+        </w:tc>
+      </w:tr>
+      <w:tr>
+        <w:tc>
+          <w:tcPr>
+            <w:tcW w:type="dxa" w:w="2016"/>
+            <w:shd w:fill="FFFFFF"/>
+            <w:tcMar>
+              <w:top w:w="90" w:type="dxa"/>
+              <w:bottom w:w="90" w:type="dxa"/>
+              <w:left w:w="140" w:type="dxa"/>
+              <w:right w:w="140" w:type="dxa"/>
+            </w:tcMar>
+          </w:tcPr>
+          <w:p>
+            <w:r>
+              <w:rPr>
+                <w:rFonts w:ascii="Calibri" w:hAnsi="Calibri"/>
+                <w:color w:val="1E293B"/>
+                <w:sz w:val="19"/>
+              </w:rPr>
+              <w:t>Title I</w:t>
+            </w:r>
+          </w:p>
+        </w:tc>
+        <w:tc>
+          <w:tcPr>
+            <w:tcW w:type="dxa" w:w="3168"/>
+            <w:shd w:fill="FFFFFF"/>
+            <w:tcMar>
+              <w:top w:w="90" w:type="dxa"/>
+              <w:bottom w:w="90" w:type="dxa"/>
+              <w:left w:w="140" w:type="dxa"/>
+              <w:right w:w="140" w:type="dxa"/>
+            </w:tcMar>
+          </w:tcPr>
+          <w:p>
+            <w:r>
+              <w:rPr>
+                <w:rFonts w:ascii="Calibri" w:hAnsi="Calibri"/>
+                <w:color w:val="1E293B"/>
+                <w:sz w:val="19"/>
+              </w:rPr>
+              <w:t>Federal Low-Income Designation</w:t>
+            </w:r>
+          </w:p>
+        </w:tc>
+        <w:tc>
+          <w:tcPr>
+            <w:tcW w:type="dxa" w:w="4176"/>
+            <w:shd w:fill="FFFFFF"/>
+            <w:tcMar>
+              <w:top w:w="90" w:type="dxa"/>
+              <w:bottom w:w="90" w:type="dxa"/>
+              <w:left w:w="140" w:type="dxa"/>
+              <w:right w:w="140" w:type="dxa"/>
+            </w:tcMar>
+          </w:tcPr>
+          <w:p>
+            <w:r>
+              <w:rPr>
+                <w:rFonts w:ascii="Calibri" w:hAnsi="Calibri"/>
+                <w:color w:val="1E293B"/>
+                <w:sz w:val="19"/>
+              </w:rPr>
+              <w:t>Elementary &amp; Secondary Education Act designation triggering +10% IRA bonus.</w:t>
+            </w:r>
+          </w:p>
+        </w:tc>
+      </w:tr>
+      <w:tr>
+        <w:tc>
+          <w:tcPr>
+            <w:tcW w:type="dxa" w:w="2016"/>
+            <w:shd w:fill="F8FAFC"/>
+            <w:tcMar>
+              <w:top w:w="90" w:type="dxa"/>
+              <w:bottom w:w="90" w:type="dxa"/>
+              <w:left w:w="140" w:type="dxa"/>
+              <w:right w:w="140" w:type="dxa"/>
+            </w:tcMar>
+          </w:tcPr>
+          <w:p>
+            <w:r>
+              <w:rPr>
+                <w:rFonts w:ascii="Calibri" w:hAnsi="Calibri"/>
+                <w:color w:val="1E293B"/>
+                <w:sz w:val="19"/>
+              </w:rPr>
+              <w:t>UTM</w:t>
+            </w:r>
+          </w:p>
+        </w:tc>
+        <w:tc>
+          <w:tcPr>
+            <w:tcW w:type="dxa" w:w="3168"/>
+            <w:shd w:fill="F8FAFC"/>
+            <w:tcMar>
+              <w:top w:w="90" w:type="dxa"/>
+              <w:bottom w:w="90" w:type="dxa"/>
+              <w:left w:w="140" w:type="dxa"/>
+              <w:right w:w="140" w:type="dxa"/>
+            </w:tcMar>
+          </w:tcPr>
+          <w:p>
+            <w:r>
+              <w:rPr>
+                <w:rFonts w:ascii="Calibri" w:hAnsi="Calibri"/>
+                <w:color w:val="1E293B"/>
+                <w:sz w:val="19"/>
+              </w:rPr>
+              <w:t>Universal Transverse Mercator</w:t>
+            </w:r>
+          </w:p>
+        </w:tc>
+        <w:tc>
+          <w:tcPr>
+            <w:tcW w:type="dxa" w:w="4176"/>
+            <w:shd w:fill="F8FAFC"/>
+            <w:tcMar>
+              <w:top w:w="90" w:type="dxa"/>
+              <w:bottom w:w="90" w:type="dxa"/>
+              <w:left w:w="140" w:type="dxa"/>
+              <w:right w:w="140" w:type="dxa"/>
+            </w:tcMar>
+          </w:tcPr>
+          <w:p>
+            <w:r>
+              <w:rPr>
+                <w:rFonts w:ascii="Calibri" w:hAnsi="Calibri"/>
+                <w:color w:val="1E293B"/>
+                <w:sz w:val="19"/>
+              </w:rPr>
+              <w:t>Conformal metric projection dividing the globe into 60 zones for accurate surface area (m2).</w:t>
+            </w:r>
+          </w:p>
+        </w:tc>
+      </w:tr>
+    </w:tbl>
+    <w:p>
+      <w:pPr>
+        <w:spacing w:after="160"/>
+      </w:pPr>
+    </w:p>
+    <w:p>
+      <w:pPr>
+        <w:pStyle w:val="Heading1"/>
         <w:spacing w:before="280"/>
       </w:pPr>
       <w:r>
         <w:rPr>
           <w:color w:val="1E3A8A"/>
         </w:rPr>
-        <w:t>2. End-to-End System Architecture</w:t>
+        <w:t>3. End-to-End System Architecture</w:t>
       </w:r>
     </w:p>
     <w:p>
@@ -705,7 +1631,7 @@
         <w:rPr>
           <w:color w:val="1E3A8A"/>
         </w:rPr>
-        <w:t>3. External API Workflows &amp; Specifications</w:t>
+        <w:t>4. External API Workflows &amp; Specifications</w:t>
       </w:r>
     </w:p>
     <w:p>
@@ -1789,7 +2715,7 @@
         <w:rPr>
           <w:color w:val="1E3A8A"/>
         </w:rPr>
-        <w:t>4. Mathematical Modeling &amp; Financial Formulations</w:t>
+        <w:t>5. Mathematical Modeling &amp; Financial Formulations</w:t>
       </w:r>
     </w:p>
     <w:p>
@@ -1797,7 +2723,7 @@
         <w:pStyle w:val="Heading2"/>
       </w:pPr>
       <w:r>
-        <w:t>4.1 System Capacity &amp; Turnkey Cost</w:t>
+        <w:t>5.1 System Capacity &amp; Turnkey Cost</w:t>
       </w:r>
     </w:p>
     <w:tbl>
@@ -1871,7 +2797,7 @@
         <w:pStyle w:val="Heading2"/>
       </w:pPr>
       <w:r>
-        <w:t>4.2 Federal IRA Section 6417 Direct Pay</w:t>
+        <w:t>5.2 Federal IRA Section 6417 Direct Pay</w:t>
       </w:r>
     </w:p>
     <w:tbl>
@@ -1947,7 +2873,7 @@
         <w:pStyle w:val="Heading2"/>
       </w:pPr>
       <w:r>
-        <w:t>4.3 Savings, Payback, and 25-Year Lifecycle Cashflow</w:t>
+        <w:t>5.3 Savings, Payback, and 25-Year Lifecycle Cashflow</w:t>
       </w:r>
     </w:p>
     <w:tbl>
@@ -2026,7 +2952,7 @@
         <w:pStyle w:val="Heading2"/>
       </w:pPr>
       <w:r>
-        <w:t>4.4 Scope 2 GHG Avoidance</w:t>
+        <w:t>5.4 Scope 2 GHG Avoidance</w:t>
       </w:r>
     </w:p>
     <w:p>
@@ -2043,7 +2969,7 @@
         <w:rPr>
           <w:color w:val="1E3A8A"/>
         </w:rPr>
-        <w:t>5. Software Architecture &amp; File Layout</w:t>
+        <w:t>6. Software Architecture &amp; File Layout</w:t>
       </w:r>
     </w:p>
     <w:tbl>
@@ -2134,7 +3060,7 @@
         <w:rPr>
           <w:color w:val="1E3A8A"/>
         </w:rPr>
-        <w:t>6. Student Defense Guide: Ten Technical Questions &amp; Answers</w:t>
+        <w:t>7. Student Defense Guide: Ten Technical Questions &amp; Answers</w:t>
       </w:r>
     </w:p>
     <w:p>
@@ -2767,590 +3693,6 @@
         <w:spacing w:after="80"/>
       </w:pPr>
     </w:p>
-    <w:p>
-      <w:pPr>
-        <w:pStyle w:val="Heading1"/>
-        <w:spacing w:before="280"/>
-      </w:pPr>
-      <w:r>
-        <w:rPr>
-          <w:color w:val="1E3A8A"/>
-        </w:rPr>
-        <w:t>7. Technical Glossary</w:t>
-      </w:r>
-    </w:p>
-    <w:tbl>
-      <w:tblPr>
-        <w:tblW w:type="auto" w:w="0"/>
-        <w:jc w:val="center"/>
-        <w:tblLayout w:type="fixed"/>
-        <w:tblLook w:firstColumn="1" w:firstRow="1" w:lastColumn="0" w:lastRow="0" w:noHBand="0" w:noVBand="1" w:val="04A0"/>
-      </w:tblPr>
-      <w:tblGrid>
-        <w:gridCol w:w="4680"/>
-        <w:gridCol w:w="4680"/>
-      </w:tblGrid>
-      <w:tr>
-        <w:tc>
-          <w:tcPr>
-            <w:tcW w:type="dxa" w:w="2880"/>
-            <w:shd w:fill="1E3A8A"/>
-            <w:tcMar>
-              <w:top w:w="120" w:type="dxa"/>
-              <w:bottom w:w="120" w:type="dxa"/>
-              <w:left w:w="140" w:type="dxa"/>
-              <w:right w:w="140" w:type="dxa"/>
-            </w:tcMar>
-          </w:tcPr>
-          <w:p>
-            <w:pPr>
-              <w:jc w:val="left"/>
-            </w:pPr>
-            <w:r>
-              <w:rPr>
-                <w:rFonts w:ascii="Calibri" w:hAnsi="Calibri"/>
-                <w:b/>
-                <w:color w:val="FFFFFF"/>
-                <w:sz w:val="20"/>
-              </w:rPr>
-              <w:t>Technical Term</w:t>
-            </w:r>
-          </w:p>
-        </w:tc>
-        <w:tc>
-          <w:tcPr>
-            <w:tcW w:type="dxa" w:w="6480"/>
-            <w:shd w:fill="1E3A8A"/>
-            <w:tcMar>
-              <w:top w:w="120" w:type="dxa"/>
-              <w:bottom w:w="120" w:type="dxa"/>
-              <w:left w:w="140" w:type="dxa"/>
-              <w:right w:w="140" w:type="dxa"/>
-            </w:tcMar>
-          </w:tcPr>
-          <w:p>
-            <w:pPr>
-              <w:jc w:val="left"/>
-            </w:pPr>
-            <w:r>
-              <w:rPr>
-                <w:rFonts w:ascii="Calibri" w:hAnsi="Calibri"/>
-                <w:b/>
-                <w:color w:val="FFFFFF"/>
-                <w:sz w:val="20"/>
-              </w:rPr>
-              <w:t>Definition</w:t>
-            </w:r>
-          </w:p>
-        </w:tc>
-      </w:tr>
-      <w:tr>
-        <w:tc>
-          <w:tcPr>
-            <w:tcW w:type="dxa" w:w="2880"/>
-            <w:shd w:fill="FFFFFF"/>
-            <w:tcMar>
-              <w:top w:w="90" w:type="dxa"/>
-              <w:bottom w:w="90" w:type="dxa"/>
-              <w:left w:w="140" w:type="dxa"/>
-              <w:right w:w="140" w:type="dxa"/>
-            </w:tcMar>
-          </w:tcPr>
-          <w:p>
-            <w:r>
-              <w:rPr>
-                <w:rFonts w:ascii="Calibri" w:hAnsi="Calibri"/>
-                <w:color w:val="1E293B"/>
-                <w:sz w:val="19"/>
-              </w:rPr>
-              <w:t>AC / DC</w:t>
-            </w:r>
-          </w:p>
-        </w:tc>
-        <w:tc>
-          <w:tcPr>
-            <w:tcW w:type="dxa" w:w="6480"/>
-            <w:shd w:fill="FFFFFF"/>
-            <w:tcMar>
-              <w:top w:w="90" w:type="dxa"/>
-              <w:bottom w:w="90" w:type="dxa"/>
-              <w:left w:w="140" w:type="dxa"/>
-              <w:right w:w="140" w:type="dxa"/>
-            </w:tcMar>
-          </w:tcPr>
-          <w:p>
-            <w:r>
-              <w:rPr>
-                <w:rFonts w:ascii="Calibri" w:hAnsi="Calibri"/>
-                <w:color w:val="1E293B"/>
-                <w:sz w:val="19"/>
-              </w:rPr>
-              <w:t>Alternating Current (grid power) / Direct Current (raw solar cell generation).</w:t>
-            </w:r>
-          </w:p>
-        </w:tc>
-      </w:tr>
-      <w:tr>
-        <w:tc>
-          <w:tcPr>
-            <w:tcW w:type="dxa" w:w="2880"/>
-            <w:shd w:fill="F8FAFC"/>
-            <w:tcMar>
-              <w:top w:w="90" w:type="dxa"/>
-              <w:bottom w:w="90" w:type="dxa"/>
-              <w:left w:w="140" w:type="dxa"/>
-              <w:right w:w="140" w:type="dxa"/>
-            </w:tcMar>
-          </w:tcPr>
-          <w:p>
-            <w:r>
-              <w:rPr>
-                <w:rFonts w:ascii="Calibri" w:hAnsi="Calibri"/>
-                <w:color w:val="1E293B"/>
-                <w:sz w:val="19"/>
-              </w:rPr>
-              <w:t>BBox</w:t>
-            </w:r>
-          </w:p>
-        </w:tc>
-        <w:tc>
-          <w:tcPr>
-            <w:tcW w:type="dxa" w:w="6480"/>
-            <w:shd w:fill="F8FAFC"/>
-            <w:tcMar>
-              <w:top w:w="90" w:type="dxa"/>
-              <w:bottom w:w="90" w:type="dxa"/>
-              <w:left w:w="140" w:type="dxa"/>
-              <w:right w:w="140" w:type="dxa"/>
-            </w:tcMar>
-          </w:tcPr>
-          <w:p>
-            <w:r>
-              <w:rPr>
-                <w:rFonts w:ascii="Calibri" w:hAnsi="Calibri"/>
-                <w:color w:val="1E293B"/>
-                <w:sz w:val="19"/>
-              </w:rPr>
-              <w:t>Bounding Box: minimum and maximum latitude/longitude coordinates enclosing a geographic area.</w:t>
-            </w:r>
-          </w:p>
-        </w:tc>
-      </w:tr>
-      <w:tr>
-        <w:tc>
-          <w:tcPr>
-            <w:tcW w:type="dxa" w:w="2880"/>
-            <w:shd w:fill="FFFFFF"/>
-            <w:tcMar>
-              <w:top w:w="90" w:type="dxa"/>
-              <w:bottom w:w="90" w:type="dxa"/>
-              <w:left w:w="140" w:type="dxa"/>
-              <w:right w:w="140" w:type="dxa"/>
-            </w:tcMar>
-          </w:tcPr>
-          <w:p>
-            <w:r>
-              <w:rPr>
-                <w:rFonts w:ascii="Calibri" w:hAnsi="Calibri"/>
-                <w:color w:val="1E293B"/>
-                <w:sz w:val="19"/>
-              </w:rPr>
-              <w:t>CDE / NCES</w:t>
-            </w:r>
-          </w:p>
-        </w:tc>
-        <w:tc>
-          <w:tcPr>
-            <w:tcW w:type="dxa" w:w="6480"/>
-            <w:shd w:fill="FFFFFF"/>
-            <w:tcMar>
-              <w:top w:w="90" w:type="dxa"/>
-              <w:bottom w:w="90" w:type="dxa"/>
-              <w:left w:w="140" w:type="dxa"/>
-              <w:right w:w="140" w:type="dxa"/>
-            </w:tcMar>
-          </w:tcPr>
-          <w:p>
-            <w:r>
-              <w:rPr>
-                <w:rFonts w:ascii="Calibri" w:hAnsi="Calibri"/>
-                <w:color w:val="1E293B"/>
-                <w:sz w:val="19"/>
-              </w:rPr>
-              <w:t>California Department of Education / National Center for Education Statistics.</w:t>
-            </w:r>
-          </w:p>
-        </w:tc>
-      </w:tr>
-      <w:tr>
-        <w:tc>
-          <w:tcPr>
-            <w:tcW w:type="dxa" w:w="2880"/>
-            <w:shd w:fill="F8FAFC"/>
-            <w:tcMar>
-              <w:top w:w="90" w:type="dxa"/>
-              <w:bottom w:w="90" w:type="dxa"/>
-              <w:left w:w="140" w:type="dxa"/>
-              <w:right w:w="140" w:type="dxa"/>
-            </w:tcMar>
-          </w:tcPr>
-          <w:p>
-            <w:r>
-              <w:rPr>
-                <w:rFonts w:ascii="Calibri" w:hAnsi="Calibri"/>
-                <w:color w:val="1E293B"/>
-                <w:sz w:val="19"/>
-              </w:rPr>
-              <w:t>CRS / EPSG:4326</w:t>
-            </w:r>
-          </w:p>
-        </w:tc>
-        <w:tc>
-          <w:tcPr>
-            <w:tcW w:type="dxa" w:w="6480"/>
-            <w:shd w:fill="F8FAFC"/>
-            <w:tcMar>
-              <w:top w:w="90" w:type="dxa"/>
-              <w:bottom w:w="90" w:type="dxa"/>
-              <w:left w:w="140" w:type="dxa"/>
-              <w:right w:w="140" w:type="dxa"/>
-            </w:tcMar>
-          </w:tcPr>
-          <w:p>
-            <w:r>
-              <w:rPr>
-                <w:rFonts w:ascii="Calibri" w:hAnsi="Calibri"/>
-                <w:color w:val="1E293B"/>
-                <w:sz w:val="19"/>
-              </w:rPr>
-              <w:t>Coordinate Reference System / Standard GPS spherical coordinates in degrees (WGS 84).</w:t>
-            </w:r>
-          </w:p>
-        </w:tc>
-      </w:tr>
-      <w:tr>
-        <w:tc>
-          <w:tcPr>
-            <w:tcW w:type="dxa" w:w="2880"/>
-            <w:shd w:fill="FFFFFF"/>
-            <w:tcMar>
-              <w:top w:w="90" w:type="dxa"/>
-              <w:bottom w:w="90" w:type="dxa"/>
-              <w:left w:w="140" w:type="dxa"/>
-              <w:right w:w="140" w:type="dxa"/>
-            </w:tcMar>
-          </w:tcPr>
-          <w:p>
-            <w:r>
-              <w:rPr>
-                <w:rFonts w:ascii="Calibri" w:hAnsi="Calibri"/>
-                <w:color w:val="1E293B"/>
-                <w:sz w:val="19"/>
-              </w:rPr>
-              <w:t>EPA eGRID</w:t>
-            </w:r>
-          </w:p>
-        </w:tc>
-        <w:tc>
-          <w:tcPr>
-            <w:tcW w:type="dxa" w:w="6480"/>
-            <w:shd w:fill="FFFFFF"/>
-            <w:tcMar>
-              <w:top w:w="90" w:type="dxa"/>
-              <w:bottom w:w="90" w:type="dxa"/>
-              <w:left w:w="140" w:type="dxa"/>
-              <w:right w:w="140" w:type="dxa"/>
-            </w:tcMar>
-          </w:tcPr>
-          <w:p>
-            <w:r>
-              <w:rPr>
-                <w:rFonts w:ascii="Calibri" w:hAnsi="Calibri"/>
-                <w:color w:val="1E293B"/>
-                <w:sz w:val="19"/>
-              </w:rPr>
-              <w:t>Emissions &amp; Generation Resource Integrated Database; federal grid carbon intensity factors.</w:t>
-            </w:r>
-          </w:p>
-        </w:tc>
-      </w:tr>
-      <w:tr>
-        <w:tc>
-          <w:tcPr>
-            <w:tcW w:type="dxa" w:w="2880"/>
-            <w:shd w:fill="F8FAFC"/>
-            <w:tcMar>
-              <w:top w:w="90" w:type="dxa"/>
-              <w:bottom w:w="90" w:type="dxa"/>
-              <w:left w:w="140" w:type="dxa"/>
-              <w:right w:w="140" w:type="dxa"/>
-            </w:tcMar>
-          </w:tcPr>
-          <w:p>
-            <w:r>
-              <w:rPr>
-                <w:rFonts w:ascii="Calibri" w:hAnsi="Calibri"/>
-                <w:color w:val="1E293B"/>
-                <w:sz w:val="19"/>
-              </w:rPr>
-              <w:t>IRA Direct Pay</w:t>
-            </w:r>
-          </w:p>
-        </w:tc>
-        <w:tc>
-          <w:tcPr>
-            <w:tcW w:type="dxa" w:w="6480"/>
-            <w:shd w:fill="F8FAFC"/>
-            <w:tcMar>
-              <w:top w:w="90" w:type="dxa"/>
-              <w:bottom w:w="90" w:type="dxa"/>
-              <w:left w:w="140" w:type="dxa"/>
-              <w:right w:w="140" w:type="dxa"/>
-            </w:tcMar>
-          </w:tcPr>
-          <w:p>
-            <w:r>
-              <w:rPr>
-                <w:rFonts w:ascii="Calibri" w:hAnsi="Calibri"/>
-                <w:color w:val="1E293B"/>
-                <w:sz w:val="19"/>
-              </w:rPr>
-              <w:t>Section 6417 of the Inflation Reduction Act enabling cash grants to non-taxable public entities.</w:t>
-            </w:r>
-          </w:p>
-        </w:tc>
-      </w:tr>
-      <w:tr>
-        <w:tc>
-          <w:tcPr>
-            <w:tcW w:type="dxa" w:w="2880"/>
-            <w:shd w:fill="FFFFFF"/>
-            <w:tcMar>
-              <w:top w:w="90" w:type="dxa"/>
-              <w:bottom w:w="90" w:type="dxa"/>
-              <w:left w:w="140" w:type="dxa"/>
-              <w:right w:w="140" w:type="dxa"/>
-            </w:tcMar>
-          </w:tcPr>
-          <w:p>
-            <w:r>
-              <w:rPr>
-                <w:rFonts w:ascii="Calibri" w:hAnsi="Calibri"/>
-                <w:color w:val="1E293B"/>
-                <w:sz w:val="19"/>
-              </w:rPr>
-              <w:t>IRS Form 990-T</w:t>
-            </w:r>
-          </w:p>
-        </w:tc>
-        <w:tc>
-          <w:tcPr>
-            <w:tcW w:type="dxa" w:w="6480"/>
-            <w:shd w:fill="FFFFFF"/>
-            <w:tcMar>
-              <w:top w:w="90" w:type="dxa"/>
-              <w:bottom w:w="90" w:type="dxa"/>
-              <w:left w:w="140" w:type="dxa"/>
-              <w:right w:w="140" w:type="dxa"/>
-            </w:tcMar>
-          </w:tcPr>
-          <w:p>
-            <w:r>
-              <w:rPr>
-                <w:rFonts w:ascii="Calibri" w:hAnsi="Calibri"/>
-                <w:color w:val="1E293B"/>
-                <w:sz w:val="19"/>
-              </w:rPr>
-              <w:t>Federal tax form through which tax-exempt public districts claim clean energy Direct Pay.</w:t>
-            </w:r>
-          </w:p>
-        </w:tc>
-      </w:tr>
-      <w:tr>
-        <w:tc>
-          <w:tcPr>
-            <w:tcW w:type="dxa" w:w="2880"/>
-            <w:shd w:fill="F8FAFC"/>
-            <w:tcMar>
-              <w:top w:w="90" w:type="dxa"/>
-              <w:bottom w:w="90" w:type="dxa"/>
-              <w:left w:w="140" w:type="dxa"/>
-              <w:right w:w="140" w:type="dxa"/>
-            </w:tcMar>
-          </w:tcPr>
-          <w:p>
-            <w:r>
-              <w:rPr>
-                <w:rFonts w:ascii="Calibri" w:hAnsi="Calibri"/>
-                <w:color w:val="1E293B"/>
-                <w:sz w:val="19"/>
-              </w:rPr>
-              <w:t>NLR / NSRDB</w:t>
-            </w:r>
-          </w:p>
-        </w:tc>
-        <w:tc>
-          <w:tcPr>
-            <w:tcW w:type="dxa" w:w="6480"/>
-            <w:shd w:fill="F8FAFC"/>
-            <w:tcMar>
-              <w:top w:w="90" w:type="dxa"/>
-              <w:bottom w:w="90" w:type="dxa"/>
-              <w:left w:w="140" w:type="dxa"/>
-              <w:right w:w="140" w:type="dxa"/>
-            </w:tcMar>
-          </w:tcPr>
-          <w:p>
-            <w:r>
-              <w:rPr>
-                <w:rFonts w:ascii="Calibri" w:hAnsi="Calibri"/>
-                <w:color w:val="1E293B"/>
-                <w:sz w:val="19"/>
-              </w:rPr>
-              <w:t>National Laboratory of the Rockies / National Solar Radiation Database (4km grid).</w:t>
-            </w:r>
-          </w:p>
-        </w:tc>
-      </w:tr>
-      <w:tr>
-        <w:tc>
-          <w:tcPr>
-            <w:tcW w:type="dxa" w:w="2880"/>
-            <w:shd w:fill="FFFFFF"/>
-            <w:tcMar>
-              <w:top w:w="90" w:type="dxa"/>
-              <w:bottom w:w="90" w:type="dxa"/>
-              <w:left w:w="140" w:type="dxa"/>
-              <w:right w:w="140" w:type="dxa"/>
-            </w:tcMar>
-          </w:tcPr>
-          <w:p>
-            <w:r>
-              <w:rPr>
-                <w:rFonts w:ascii="Calibri" w:hAnsi="Calibri"/>
-                <w:color w:val="1E293B"/>
-                <w:sz w:val="19"/>
-              </w:rPr>
-              <w:t>POA</w:t>
-            </w:r>
-          </w:p>
-        </w:tc>
-        <w:tc>
-          <w:tcPr>
-            <w:tcW w:type="dxa" w:w="6480"/>
-            <w:shd w:fill="FFFFFF"/>
-            <w:tcMar>
-              <w:top w:w="90" w:type="dxa"/>
-              <w:bottom w:w="90" w:type="dxa"/>
-              <w:left w:w="140" w:type="dxa"/>
-              <w:right w:w="140" w:type="dxa"/>
-            </w:tcMar>
-          </w:tcPr>
-          <w:p>
-            <w:r>
-              <w:rPr>
-                <w:rFonts w:ascii="Calibri" w:hAnsi="Calibri"/>
-                <w:color w:val="1E293B"/>
-                <w:sz w:val="19"/>
-              </w:rPr>
-              <w:t>Plane of Array: solar irradiance striking tilted photovoltaic module surfaces.</w:t>
-            </w:r>
-          </w:p>
-        </w:tc>
-      </w:tr>
-      <w:tr>
-        <w:tc>
-          <w:tcPr>
-            <w:tcW w:type="dxa" w:w="2880"/>
-            <w:shd w:fill="F8FAFC"/>
-            <w:tcMar>
-              <w:top w:w="90" w:type="dxa"/>
-              <w:bottom w:w="90" w:type="dxa"/>
-              <w:left w:w="140" w:type="dxa"/>
-              <w:right w:w="140" w:type="dxa"/>
-            </w:tcMar>
-          </w:tcPr>
-          <w:p>
-            <w:r>
-              <w:rPr>
-                <w:rFonts w:ascii="Calibri" w:hAnsi="Calibri"/>
-                <w:color w:val="1E293B"/>
-                <w:sz w:val="19"/>
-              </w:rPr>
-              <w:t>Title I</w:t>
-            </w:r>
-          </w:p>
-        </w:tc>
-        <w:tc>
-          <w:tcPr>
-            <w:tcW w:type="dxa" w:w="6480"/>
-            <w:shd w:fill="F8FAFC"/>
-            <w:tcMar>
-              <w:top w:w="90" w:type="dxa"/>
-              <w:bottom w:w="90" w:type="dxa"/>
-              <w:left w:w="140" w:type="dxa"/>
-              <w:right w:w="140" w:type="dxa"/>
-            </w:tcMar>
-          </w:tcPr>
-          <w:p>
-            <w:r>
-              <w:rPr>
-                <w:rFonts w:ascii="Calibri" w:hAnsi="Calibri"/>
-                <w:color w:val="1E293B"/>
-                <w:sz w:val="19"/>
-              </w:rPr>
-              <w:t>Federal designation for schools where at least 40% of students come from low-income families.</w:t>
-            </w:r>
-          </w:p>
-        </w:tc>
-      </w:tr>
-      <w:tr>
-        <w:tc>
-          <w:tcPr>
-            <w:tcW w:type="dxa" w:w="2880"/>
-            <w:shd w:fill="FFFFFF"/>
-            <w:tcMar>
-              <w:top w:w="90" w:type="dxa"/>
-              <w:bottom w:w="90" w:type="dxa"/>
-              <w:left w:w="140" w:type="dxa"/>
-              <w:right w:w="140" w:type="dxa"/>
-            </w:tcMar>
-          </w:tcPr>
-          <w:p>
-            <w:r>
-              <w:rPr>
-                <w:rFonts w:ascii="Calibri" w:hAnsi="Calibri"/>
-                <w:color w:val="1E293B"/>
-                <w:sz w:val="19"/>
-              </w:rPr>
-              <w:t>UTM</w:t>
-            </w:r>
-          </w:p>
-        </w:tc>
-        <w:tc>
-          <w:tcPr>
-            <w:tcW w:type="dxa" w:w="6480"/>
-            <w:shd w:fill="FFFFFF"/>
-            <w:tcMar>
-              <w:top w:w="90" w:type="dxa"/>
-              <w:bottom w:w="90" w:type="dxa"/>
-              <w:left w:w="140" w:type="dxa"/>
-              <w:right w:w="140" w:type="dxa"/>
-            </w:tcMar>
-          </w:tcPr>
-          <w:p>
-            <w:r>
-              <w:rPr>
-                <w:rFonts w:ascii="Calibri" w:hAnsi="Calibri"/>
-                <w:color w:val="1E293B"/>
-                <w:sz w:val="19"/>
-              </w:rPr>
-              <w:t>Universal Transverse Mercator: metric map projection dividing the globe into 60 flat zones.</w:t>
-            </w:r>
-          </w:p>
-        </w:tc>
-      </w:tr>
-    </w:tbl>
     <w:sectPr>
       <w:pgSz w:w="12240" w:h="15840"/>
       <w:pgMar w:top="1440" w:right="1440" w:bottom="1440" w:left="1440" w:header="720" w:footer="720" w:gutter="0"/>

</xml_diff>

<commit_message>
Position Table of Abbreviations as Section 1 before Executive Summary
</commit_message>
<xml_diff>
--- a/DetailedDesignDocument.docx
+++ b/DetailedDesignDocument.docx
@@ -104,534 +104,7 @@
         <w:rPr>
           <w:color w:val="1E3A8A"/>
         </w:rPr>
-        <w:t>1. Executive Summary &amp; Design Rationale</w:t>
-      </w:r>
-    </w:p>
-    <w:p>
-      <w:pPr>
-        <w:pStyle w:val="Heading2"/>
-      </w:pPr>
-      <w:r>
-        <w:t>1.1 Problem &amp; Opportunity</w:t>
-      </w:r>
-    </w:p>
-    <w:p>
-      <w:pPr>
-        <w:pStyle w:val="ListBullet"/>
-      </w:pPr>
-      <w:r>
-        <w:rPr>
-          <w:b/>
-        </w:rPr>
-        <w:t xml:space="preserve">Energy Burden: </w:t>
-      </w:r>
-      <w:r>
-        <w:t>Public K-12 school districts spend over $8 billion annually on electricity, often their second-largest budget expense after personnel.</w:t>
-      </w:r>
-    </w:p>
-    <w:p>
-      <w:pPr>
-        <w:pStyle w:val="ListBullet"/>
-      </w:pPr>
-      <w:r>
-        <w:rPr>
-          <w:b/>
-        </w:rPr>
-        <w:t xml:space="preserve">Underutilized Asset: </w:t>
-      </w:r>
-      <w:r>
-        <w:t>Schools maintain extensive unshaded asphalt parking lots that intensify the urban heat island effect and increase cooling loads.</w:t>
-      </w:r>
-    </w:p>
-    <w:p>
-      <w:pPr>
-        <w:pStyle w:val="ListBullet"/>
-      </w:pPr>
-      <w:r>
-        <w:rPr>
-          <w:b/>
-        </w:rPr>
-        <w:t xml:space="preserve">Federal Catalyst: </w:t>
-      </w:r>
-      <w:r>
-        <w:t>Section 6417 of the Inflation Reduction Act (IRA) allows non-taxable entities—including public school districts—to receive elective cash payments ('Direct Pay') from the IRS covering 30% to 50% of clean energy project costs.</w:t>
-      </w:r>
-    </w:p>
-    <w:p>
-      <w:pPr>
-        <w:pStyle w:val="ListBullet"/>
-      </w:pPr>
-      <w:r>
-        <w:rPr>
-          <w:b/>
-        </w:rPr>
-        <w:t xml:space="preserve">Access Barrier: </w:t>
-      </w:r>
-      <w:r>
-        <w:t>Commercial feasibility studies cost $15,000 to $50,000. SolarSchools USA provides a free, instant screening tool for student advocates and school boards.</w:t>
-      </w:r>
-    </w:p>
-    <w:p>
-      <w:pPr>
-        <w:pStyle w:val="Heading2"/>
-      </w:pPr>
-      <w:r>
-        <w:t>1.2 Parking Canopies vs. Rooftop Solar</w:t>
-      </w:r>
-    </w:p>
-    <w:p>
-      <w:r>
-        <w:t>Commercial solar developers often suggest rooftop panels, but facilities directors face significant obstacles that parking lot canopies eliminate:</w:t>
-      </w:r>
-    </w:p>
-    <w:tbl>
-      <w:tblPr>
-        <w:tblW w:type="auto" w:w="0"/>
-        <w:jc w:val="center"/>
-        <w:tblLayout w:type="fixed"/>
-        <w:tblLook w:firstColumn="1" w:firstRow="1" w:lastColumn="0" w:lastRow="0" w:noHBand="0" w:noVBand="1" w:val="04A0"/>
-      </w:tblPr>
-      <w:tblGrid>
-        <w:gridCol w:w="3120"/>
-        <w:gridCol w:w="3120"/>
-        <w:gridCol w:w="3120"/>
-      </w:tblGrid>
-      <w:tr>
-        <w:tc>
-          <w:tcPr>
-            <w:tcW w:type="dxa" w:w="2160"/>
-            <w:shd w:fill="1E3A8A"/>
-            <w:tcMar>
-              <w:top w:w="120" w:type="dxa"/>
-              <w:bottom w:w="120" w:type="dxa"/>
-              <w:left w:w="140" w:type="dxa"/>
-              <w:right w:w="140" w:type="dxa"/>
-            </w:tcMar>
-          </w:tcPr>
-          <w:p>
-            <w:pPr>
-              <w:jc w:val="left"/>
-            </w:pPr>
-            <w:r>
-              <w:rPr>
-                <w:rFonts w:ascii="Calibri" w:hAnsi="Calibri"/>
-                <w:b/>
-                <w:color w:val="FFFFFF"/>
-                <w:sz w:val="20"/>
-              </w:rPr>
-              <w:t>Evaluation Metric</w:t>
-            </w:r>
-          </w:p>
-        </w:tc>
-        <w:tc>
-          <w:tcPr>
-            <w:tcW w:type="dxa" w:w="3312"/>
-            <w:shd w:fill="1E3A8A"/>
-            <w:tcMar>
-              <w:top w:w="120" w:type="dxa"/>
-              <w:bottom w:w="120" w:type="dxa"/>
-              <w:left w:w="140" w:type="dxa"/>
-              <w:right w:w="140" w:type="dxa"/>
-            </w:tcMar>
-          </w:tcPr>
-          <w:p>
-            <w:pPr>
-              <w:jc w:val="left"/>
-            </w:pPr>
-            <w:r>
-              <w:rPr>
-                <w:rFonts w:ascii="Calibri" w:hAnsi="Calibri"/>
-                <w:b/>
-                <w:color w:val="FFFFFF"/>
-                <w:sz w:val="20"/>
-              </w:rPr>
-              <w:t>Rooftop Solar</w:t>
-            </w:r>
-          </w:p>
-        </w:tc>
-        <w:tc>
-          <w:tcPr>
-            <w:tcW w:type="dxa" w:w="3888"/>
-            <w:shd w:fill="1E3A8A"/>
-            <w:tcMar>
-              <w:top w:w="120" w:type="dxa"/>
-              <w:bottom w:w="120" w:type="dxa"/>
-              <w:left w:w="140" w:type="dxa"/>
-              <w:right w:w="140" w:type="dxa"/>
-            </w:tcMar>
-          </w:tcPr>
-          <w:p>
-            <w:pPr>
-              <w:jc w:val="left"/>
-            </w:pPr>
-            <w:r>
-              <w:rPr>
-                <w:rFonts w:ascii="Calibri" w:hAnsi="Calibri"/>
-                <w:b/>
-                <w:color w:val="FFFFFF"/>
-                <w:sz w:val="20"/>
-              </w:rPr>
-              <w:t>Parking Lot Canopy (SolarSchools USA)</w:t>
-            </w:r>
-          </w:p>
-        </w:tc>
-      </w:tr>
-      <w:tr>
-        <w:tc>
-          <w:tcPr>
-            <w:tcW w:type="dxa" w:w="2160"/>
-            <w:shd w:fill="FFFFFF"/>
-            <w:tcMar>
-              <w:top w:w="90" w:type="dxa"/>
-              <w:bottom w:w="90" w:type="dxa"/>
-              <w:left w:w="140" w:type="dxa"/>
-              <w:right w:w="140" w:type="dxa"/>
-            </w:tcMar>
-          </w:tcPr>
-          <w:p>
-            <w:r>
-              <w:rPr>
-                <w:rFonts w:ascii="Calibri" w:hAnsi="Calibri"/>
-                <w:color w:val="1E293B"/>
-                <w:sz w:val="19"/>
-              </w:rPr>
-              <w:t>Roof Warranty</w:t>
-            </w:r>
-          </w:p>
-        </w:tc>
-        <w:tc>
-          <w:tcPr>
-            <w:tcW w:type="dxa" w:w="3312"/>
-            <w:shd w:fill="FFFFFF"/>
-            <w:tcMar>
-              <w:top w:w="90" w:type="dxa"/>
-              <w:bottom w:w="90" w:type="dxa"/>
-              <w:left w:w="140" w:type="dxa"/>
-              <w:right w:w="140" w:type="dxa"/>
-            </w:tcMar>
-          </w:tcPr>
-          <w:p>
-            <w:r>
-              <w:rPr>
-                <w:rFonts w:ascii="Calibri" w:hAnsi="Calibri"/>
-                <w:color w:val="1E293B"/>
-                <w:sz w:val="19"/>
-              </w:rPr>
-              <w:t>Risk of voiding 20-year membrane warranty</w:t>
-            </w:r>
-          </w:p>
-        </w:tc>
-        <w:tc>
-          <w:tcPr>
-            <w:tcW w:type="dxa" w:w="3888"/>
-            <w:shd w:fill="FFFFFF"/>
-            <w:tcMar>
-              <w:top w:w="90" w:type="dxa"/>
-              <w:bottom w:w="90" w:type="dxa"/>
-              <w:left w:w="140" w:type="dxa"/>
-              <w:right w:w="140" w:type="dxa"/>
-            </w:tcMar>
-          </w:tcPr>
-          <w:p>
-            <w:r>
-              <w:rPr>
-                <w:rFonts w:ascii="Calibri" w:hAnsi="Calibri"/>
-                <w:color w:val="1E293B"/>
-                <w:sz w:val="19"/>
-              </w:rPr>
-              <w:t>Zero roof penetrations; independent structural steel</w:t>
-            </w:r>
-          </w:p>
-        </w:tc>
-      </w:tr>
-      <w:tr>
-        <w:tc>
-          <w:tcPr>
-            <w:tcW w:type="dxa" w:w="2160"/>
-            <w:shd w:fill="F8FAFC"/>
-            <w:tcMar>
-              <w:top w:w="90" w:type="dxa"/>
-              <w:bottom w:w="90" w:type="dxa"/>
-              <w:left w:w="140" w:type="dxa"/>
-              <w:right w:w="140" w:type="dxa"/>
-            </w:tcMar>
-          </w:tcPr>
-          <w:p>
-            <w:r>
-              <w:rPr>
-                <w:rFonts w:ascii="Calibri" w:hAnsi="Calibri"/>
-                <w:color w:val="1E293B"/>
-                <w:sz w:val="19"/>
-              </w:rPr>
-              <w:t>Structural Capacity</w:t>
-            </w:r>
-          </w:p>
-        </w:tc>
-        <w:tc>
-          <w:tcPr>
-            <w:tcW w:type="dxa" w:w="3312"/>
-            <w:shd w:fill="F8FAFC"/>
-            <w:tcMar>
-              <w:top w:w="90" w:type="dxa"/>
-              <w:bottom w:w="90" w:type="dxa"/>
-              <w:left w:w="140" w:type="dxa"/>
-              <w:right w:w="140" w:type="dxa"/>
-            </w:tcMar>
-          </w:tcPr>
-          <w:p>
-            <w:r>
-              <w:rPr>
-                <w:rFonts w:ascii="Calibri" w:hAnsi="Calibri"/>
-                <w:color w:val="1E293B"/>
-                <w:sz w:val="19"/>
-              </w:rPr>
-              <w:t>Limited by HVAC weight and seismic ratings</w:t>
-            </w:r>
-          </w:p>
-        </w:tc>
-        <w:tc>
-          <w:tcPr>
-            <w:tcW w:type="dxa" w:w="3888"/>
-            <w:shd w:fill="F8FAFC"/>
-            <w:tcMar>
-              <w:top w:w="90" w:type="dxa"/>
-              <w:bottom w:w="90" w:type="dxa"/>
-              <w:left w:w="140" w:type="dxa"/>
-              <w:right w:w="140" w:type="dxa"/>
-            </w:tcMar>
-          </w:tcPr>
-          <w:p>
-            <w:r>
-              <w:rPr>
-                <w:rFonts w:ascii="Calibri" w:hAnsi="Calibri"/>
-                <w:color w:val="1E293B"/>
-                <w:sz w:val="19"/>
-              </w:rPr>
-              <w:t>Engineered independent pier foundations</w:t>
-            </w:r>
-          </w:p>
-        </w:tc>
-      </w:tr>
-      <w:tr>
-        <w:tc>
-          <w:tcPr>
-            <w:tcW w:type="dxa" w:w="2160"/>
-            <w:shd w:fill="FFFFFF"/>
-            <w:tcMar>
-              <w:top w:w="90" w:type="dxa"/>
-              <w:bottom w:w="90" w:type="dxa"/>
-              <w:left w:w="140" w:type="dxa"/>
-              <w:right w:w="140" w:type="dxa"/>
-            </w:tcMar>
-          </w:tcPr>
-          <w:p>
-            <w:r>
-              <w:rPr>
-                <w:rFonts w:ascii="Calibri" w:hAnsi="Calibri"/>
-                <w:color w:val="1E293B"/>
-                <w:sz w:val="19"/>
-              </w:rPr>
-              <w:t>Microclimate Impact</w:t>
-            </w:r>
-          </w:p>
-        </w:tc>
-        <w:tc>
-          <w:tcPr>
-            <w:tcW w:type="dxa" w:w="3312"/>
-            <w:shd w:fill="FFFFFF"/>
-            <w:tcMar>
-              <w:top w:w="90" w:type="dxa"/>
-              <w:bottom w:w="90" w:type="dxa"/>
-              <w:left w:w="140" w:type="dxa"/>
-              <w:right w:w="140" w:type="dxa"/>
-            </w:tcMar>
-          </w:tcPr>
-          <w:p>
-            <w:r>
-              <w:rPr>
-                <w:rFonts w:ascii="Calibri" w:hAnsi="Calibri"/>
-                <w:color w:val="1E293B"/>
-                <w:sz w:val="19"/>
-              </w:rPr>
-              <w:t>Minor roof cooling</w:t>
-            </w:r>
-          </w:p>
-        </w:tc>
-        <w:tc>
-          <w:tcPr>
-            <w:tcW w:type="dxa" w:w="3888"/>
-            <w:shd w:fill="FFFFFF"/>
-            <w:tcMar>
-              <w:top w:w="90" w:type="dxa"/>
-              <w:bottom w:w="90" w:type="dxa"/>
-              <w:left w:w="140" w:type="dxa"/>
-              <w:right w:w="140" w:type="dxa"/>
-            </w:tcMar>
-          </w:tcPr>
-          <w:p>
-            <w:r>
-              <w:rPr>
-                <w:rFonts w:ascii="Calibri" w:hAnsi="Calibri"/>
-                <w:color w:val="1E293B"/>
-                <w:sz w:val="19"/>
-              </w:rPr>
-              <w:t>Drops asphalt surface temp by 30°F to 45°F</w:t>
-            </w:r>
-          </w:p>
-        </w:tc>
-      </w:tr>
-      <w:tr>
-        <w:tc>
-          <w:tcPr>
-            <w:tcW w:type="dxa" w:w="2160"/>
-            <w:shd w:fill="F8FAFC"/>
-            <w:tcMar>
-              <w:top w:w="90" w:type="dxa"/>
-              <w:bottom w:w="90" w:type="dxa"/>
-              <w:left w:w="140" w:type="dxa"/>
-              <w:right w:w="140" w:type="dxa"/>
-            </w:tcMar>
-          </w:tcPr>
-          <w:p>
-            <w:r>
-              <w:rPr>
-                <w:rFonts w:ascii="Calibri" w:hAnsi="Calibri"/>
-                <w:color w:val="1E293B"/>
-                <w:sz w:val="19"/>
-              </w:rPr>
-              <w:t>EV Integration</w:t>
-            </w:r>
-          </w:p>
-        </w:tc>
-        <w:tc>
-          <w:tcPr>
-            <w:tcW w:type="dxa" w:w="3312"/>
-            <w:shd w:fill="F8FAFC"/>
-            <w:tcMar>
-              <w:top w:w="90" w:type="dxa"/>
-              <w:bottom w:w="90" w:type="dxa"/>
-              <w:left w:w="140" w:type="dxa"/>
-              <w:right w:w="140" w:type="dxa"/>
-            </w:tcMar>
-          </w:tcPr>
-          <w:p>
-            <w:r>
-              <w:rPr>
-                <w:rFonts w:ascii="Calibri" w:hAnsi="Calibri"/>
-                <w:color w:val="1E293B"/>
-                <w:sz w:val="19"/>
-              </w:rPr>
-              <w:t>Requires expensive trenching to ground lot</w:t>
-            </w:r>
-          </w:p>
-        </w:tc>
-        <w:tc>
-          <w:tcPr>
-            <w:tcW w:type="dxa" w:w="3888"/>
-            <w:shd w:fill="F8FAFC"/>
-            <w:tcMar>
-              <w:top w:w="90" w:type="dxa"/>
-              <w:bottom w:w="90" w:type="dxa"/>
-              <w:left w:w="140" w:type="dxa"/>
-              <w:right w:w="140" w:type="dxa"/>
-            </w:tcMar>
-          </w:tcPr>
-          <w:p>
-            <w:r>
-              <w:rPr>
-                <w:rFonts w:ascii="Calibri" w:hAnsi="Calibri"/>
-                <w:color w:val="1E293B"/>
-                <w:sz w:val="19"/>
-              </w:rPr>
-              <w:t>Turnkey conduit integration for Level 2 EV chargers</w:t>
-            </w:r>
-          </w:p>
-        </w:tc>
-      </w:tr>
-      <w:tr>
-        <w:tc>
-          <w:tcPr>
-            <w:tcW w:type="dxa" w:w="2160"/>
-            <w:shd w:fill="FFFFFF"/>
-            <w:tcMar>
-              <w:top w:w="90" w:type="dxa"/>
-              <w:bottom w:w="90" w:type="dxa"/>
-              <w:left w:w="140" w:type="dxa"/>
-              <w:right w:w="140" w:type="dxa"/>
-            </w:tcMar>
-          </w:tcPr>
-          <w:p>
-            <w:r>
-              <w:rPr>
-                <w:rFonts w:ascii="Calibri" w:hAnsi="Calibri"/>
-                <w:color w:val="1E293B"/>
-                <w:sz w:val="19"/>
-              </w:rPr>
-              <w:t>Campus Visibility</w:t>
-            </w:r>
-          </w:p>
-        </w:tc>
-        <w:tc>
-          <w:tcPr>
-            <w:tcW w:type="dxa" w:w="3312"/>
-            <w:shd w:fill="FFFFFF"/>
-            <w:tcMar>
-              <w:top w:w="90" w:type="dxa"/>
-              <w:bottom w:w="90" w:type="dxa"/>
-              <w:left w:w="140" w:type="dxa"/>
-              <w:right w:w="140" w:type="dxa"/>
-            </w:tcMar>
-          </w:tcPr>
-          <w:p>
-            <w:r>
-              <w:rPr>
-                <w:rFonts w:ascii="Calibri" w:hAnsi="Calibri"/>
-                <w:color w:val="1E293B"/>
-                <w:sz w:val="19"/>
-              </w:rPr>
-              <w:t>Hidden from student and community view</w:t>
-            </w:r>
-          </w:p>
-        </w:tc>
-        <w:tc>
-          <w:tcPr>
-            <w:tcW w:type="dxa" w:w="3888"/>
-            <w:shd w:fill="FFFFFF"/>
-            <w:tcMar>
-              <w:top w:w="90" w:type="dxa"/>
-              <w:bottom w:w="90" w:type="dxa"/>
-              <w:left w:w="140" w:type="dxa"/>
-              <w:right w:w="140" w:type="dxa"/>
-            </w:tcMar>
-          </w:tcPr>
-          <w:p>
-            <w:r>
-              <w:rPr>
-                <w:rFonts w:ascii="Calibri" w:hAnsi="Calibri"/>
-                <w:color w:val="1E293B"/>
-                <w:sz w:val="19"/>
-              </w:rPr>
-              <w:t>Highly visible showcase of civic climate leadership</w:t>
-            </w:r>
-          </w:p>
-        </w:tc>
-      </w:tr>
-    </w:tbl>
-    <w:p>
-      <w:pPr>
-        <w:spacing w:after="160"/>
-      </w:pPr>
-    </w:p>
-    <w:p>
-      <w:pPr>
-        <w:pStyle w:val="Heading1"/>
-        <w:spacing w:before="280" w:after="120"/>
-      </w:pPr>
-      <w:r>
-        <w:rPr>
-          <w:color w:val="1E3A8A"/>
-        </w:rPr>
-        <w:t>2. Table of Abbreviations &amp; Core Terminology</w:t>
+        <w:t>1. Table of Abbreviations &amp; Core Terminology</w:t>
       </w:r>
     </w:p>
     <w:tbl>
@@ -1085,7 +558,7 @@
                 <w:color w:val="1E293B"/>
                 <w:sz w:val="19"/>
               </w:rPr>
-              <w:t>IRA Direct Pay</w:t>
+              <w:t>EV</w:t>
             </w:r>
           </w:p>
         </w:tc>
@@ -1107,6 +580,74 @@
                 <w:color w:val="1E293B"/>
                 <w:sz w:val="19"/>
               </w:rPr>
+              <w:t>Electric Vehicle</w:t>
+            </w:r>
+          </w:p>
+        </w:tc>
+        <w:tc>
+          <w:tcPr>
+            <w:tcW w:type="dxa" w:w="4176"/>
+            <w:shd w:fill="F8FAFC"/>
+            <w:tcMar>
+              <w:top w:w="90" w:type="dxa"/>
+              <w:bottom w:w="90" w:type="dxa"/>
+              <w:left w:w="140" w:type="dxa"/>
+              <w:right w:w="140" w:type="dxa"/>
+            </w:tcMar>
+          </w:tcPr>
+          <w:p>
+            <w:r>
+              <w:rPr>
+                <w:rFonts w:ascii="Calibri" w:hAnsi="Calibri"/>
+                <w:color w:val="1E293B"/>
+                <w:sz w:val="19"/>
+              </w:rPr>
+              <w:t>Level 2 smart vehicle charging stations integrated into canopy steel columns.</w:t>
+            </w:r>
+          </w:p>
+        </w:tc>
+      </w:tr>
+      <w:tr>
+        <w:tc>
+          <w:tcPr>
+            <w:tcW w:type="dxa" w:w="2016"/>
+            <w:shd w:fill="FFFFFF"/>
+            <w:tcMar>
+              <w:top w:w="90" w:type="dxa"/>
+              <w:bottom w:w="90" w:type="dxa"/>
+              <w:left w:w="140" w:type="dxa"/>
+              <w:right w:w="140" w:type="dxa"/>
+            </w:tcMar>
+          </w:tcPr>
+          <w:p>
+            <w:r>
+              <w:rPr>
+                <w:rFonts w:ascii="Calibri" w:hAnsi="Calibri"/>
+                <w:color w:val="1E293B"/>
+                <w:sz w:val="19"/>
+              </w:rPr>
+              <w:t>IRA Direct Pay</w:t>
+            </w:r>
+          </w:p>
+        </w:tc>
+        <w:tc>
+          <w:tcPr>
+            <w:tcW w:type="dxa" w:w="3168"/>
+            <w:shd w:fill="FFFFFF"/>
+            <w:tcMar>
+              <w:top w:w="90" w:type="dxa"/>
+              <w:bottom w:w="90" w:type="dxa"/>
+              <w:left w:w="140" w:type="dxa"/>
+              <w:right w:w="140" w:type="dxa"/>
+            </w:tcMar>
+          </w:tcPr>
+          <w:p>
+            <w:r>
+              <w:rPr>
+                <w:rFonts w:ascii="Calibri" w:hAnsi="Calibri"/>
+                <w:color w:val="1E293B"/>
+                <w:sz w:val="19"/>
+              </w:rPr>
               <w:t>Inflation Reduction Act Section 6417</w:t>
             </w:r>
           </w:p>
@@ -1114,7 +655,7 @@
         <w:tc>
           <w:tcPr>
             <w:tcW w:type="dxa" w:w="4176"/>
-            <w:shd w:fill="F8FAFC"/>
+            <w:shd w:fill="FFFFFF"/>
             <w:tcMar>
               <w:top w:w="90" w:type="dxa"/>
               <w:bottom w:w="90" w:type="dxa"/>
@@ -1138,6 +679,74 @@
         <w:tc>
           <w:tcPr>
             <w:tcW w:type="dxa" w:w="2016"/>
+            <w:shd w:fill="F8FAFC"/>
+            <w:tcMar>
+              <w:top w:w="90" w:type="dxa"/>
+              <w:bottom w:w="90" w:type="dxa"/>
+              <w:left w:w="140" w:type="dxa"/>
+              <w:right w:w="140" w:type="dxa"/>
+            </w:tcMar>
+          </w:tcPr>
+          <w:p>
+            <w:r>
+              <w:rPr>
+                <w:rFonts w:ascii="Calibri" w:hAnsi="Calibri"/>
+                <w:color w:val="1E293B"/>
+                <w:sz w:val="19"/>
+              </w:rPr>
+              <w:t>IRS / Form 990-T</w:t>
+            </w:r>
+          </w:p>
+        </w:tc>
+        <w:tc>
+          <w:tcPr>
+            <w:tcW w:type="dxa" w:w="3168"/>
+            <w:shd w:fill="F8FAFC"/>
+            <w:tcMar>
+              <w:top w:w="90" w:type="dxa"/>
+              <w:bottom w:w="90" w:type="dxa"/>
+              <w:left w:w="140" w:type="dxa"/>
+              <w:right w:w="140" w:type="dxa"/>
+            </w:tcMar>
+          </w:tcPr>
+          <w:p>
+            <w:r>
+              <w:rPr>
+                <w:rFonts w:ascii="Calibri" w:hAnsi="Calibri"/>
+                <w:color w:val="1E293B"/>
+                <w:sz w:val="19"/>
+              </w:rPr>
+              <w:t>Internal Revenue Service</w:t>
+            </w:r>
+          </w:p>
+        </w:tc>
+        <w:tc>
+          <w:tcPr>
+            <w:tcW w:type="dxa" w:w="4176"/>
+            <w:shd w:fill="F8FAFC"/>
+            <w:tcMar>
+              <w:top w:w="90" w:type="dxa"/>
+              <w:bottom w:w="90" w:type="dxa"/>
+              <w:left w:w="140" w:type="dxa"/>
+              <w:right w:w="140" w:type="dxa"/>
+            </w:tcMar>
+          </w:tcPr>
+          <w:p>
+            <w:r>
+              <w:rPr>
+                <w:rFonts w:ascii="Calibri" w:hAnsi="Calibri"/>
+                <w:color w:val="1E293B"/>
+                <w:sz w:val="19"/>
+              </w:rPr>
+              <w:t>Federal tax agency; Form 990-T is filed by public school districts to claim Direct Pay.</w:t>
+            </w:r>
+          </w:p>
+        </w:tc>
+      </w:tr>
+      <w:tr>
+        <w:tc>
+          <w:tcPr>
+            <w:tcW w:type="dxa" w:w="2016"/>
             <w:shd w:fill="FFFFFF"/>
             <w:tcMar>
               <w:top w:w="90" w:type="dxa"/>
@@ -1153,7 +762,7 @@
                 <w:color w:val="1E293B"/>
                 <w:sz w:val="19"/>
               </w:rPr>
-              <w:t>IRS Form 990-T</w:t>
+              <w:t>K-12</w:t>
             </w:r>
           </w:p>
         </w:tc>
@@ -1175,7 +784,7 @@
                 <w:color w:val="1E293B"/>
                 <w:sz w:val="19"/>
               </w:rPr>
-              <w:t>Tax-Exempt Return</w:t>
+              <w:t>Kindergarten through 12th Grade</w:t>
             </w:r>
           </w:p>
         </w:tc>
@@ -1197,7 +806,7 @@
                 <w:color w:val="1E293B"/>
                 <w:sz w:val="19"/>
               </w:rPr>
-              <w:t>Federal tax form filed by public school districts to claim clean energy Direct Pay.</w:t>
+              <w:t>The United States public primary and secondary education school system.</w:t>
             </w:r>
           </w:p>
         </w:tc>
@@ -1538,6 +1147,533 @@
                 <w:sz w:val="19"/>
               </w:rPr>
               <w:t>Conformal metric projection dividing the globe into 60 zones for accurate surface area (m2).</w:t>
+            </w:r>
+          </w:p>
+        </w:tc>
+      </w:tr>
+    </w:tbl>
+    <w:p>
+      <w:pPr>
+        <w:spacing w:after="160"/>
+      </w:pPr>
+    </w:p>
+    <w:p>
+      <w:pPr>
+        <w:pStyle w:val="Heading1"/>
+        <w:spacing w:before="280" w:after="120"/>
+      </w:pPr>
+      <w:r>
+        <w:rPr>
+          <w:color w:val="1E3A8A"/>
+        </w:rPr>
+        <w:t>2. Executive Summary &amp; Design Rationale</w:t>
+      </w:r>
+    </w:p>
+    <w:p>
+      <w:pPr>
+        <w:pStyle w:val="Heading2"/>
+      </w:pPr>
+      <w:r>
+        <w:t>2.1 Problem &amp; Opportunity</w:t>
+      </w:r>
+    </w:p>
+    <w:p>
+      <w:pPr>
+        <w:pStyle w:val="ListBullet"/>
+      </w:pPr>
+      <w:r>
+        <w:rPr>
+          <w:b/>
+        </w:rPr>
+        <w:t xml:space="preserve">Energy Burden: </w:t>
+      </w:r>
+      <w:r>
+        <w:t>Public Kindergarten through 12th Grade (K-12) school districts spend over $8 billion annually on electricity, often their second-largest budget expense after personnel.</w:t>
+      </w:r>
+    </w:p>
+    <w:p>
+      <w:pPr>
+        <w:pStyle w:val="ListBullet"/>
+      </w:pPr>
+      <w:r>
+        <w:rPr>
+          <w:b/>
+        </w:rPr>
+        <w:t xml:space="preserve">Underutilized Asset: </w:t>
+      </w:r>
+      <w:r>
+        <w:t>Schools maintain extensive unshaded asphalt parking lots that intensify the urban heat island effect and increase cooling loads.</w:t>
+      </w:r>
+    </w:p>
+    <w:p>
+      <w:pPr>
+        <w:pStyle w:val="ListBullet"/>
+      </w:pPr>
+      <w:r>
+        <w:rPr>
+          <w:b/>
+        </w:rPr>
+        <w:t xml:space="preserve">Federal Catalyst: </w:t>
+      </w:r>
+      <w:r>
+        <w:t>Section 6417 of the federal Inflation Reduction Act (IRA) allows non-taxable entities—including public school districts—to receive elective cash payments ('Direct Pay') from the Internal Revenue Service (IRS) covering 30% to 50% of clean energy project costs.</w:t>
+      </w:r>
+    </w:p>
+    <w:p>
+      <w:pPr>
+        <w:pStyle w:val="ListBullet"/>
+      </w:pPr>
+      <w:r>
+        <w:rPr>
+          <w:b/>
+        </w:rPr>
+        <w:t xml:space="preserve">Access Barrier: </w:t>
+      </w:r>
+      <w:r>
+        <w:t>Commercial feasibility studies cost $15,000 to $50,000. SolarSchools USA provides a free, instant screening tool for student advocates and school boards.</w:t>
+      </w:r>
+    </w:p>
+    <w:p>
+      <w:pPr>
+        <w:pStyle w:val="Heading2"/>
+      </w:pPr>
+      <w:r>
+        <w:t>2.2 Parking Canopies vs. Rooftop Solar</w:t>
+      </w:r>
+    </w:p>
+    <w:p>
+      <w:r>
+        <w:t>Commercial solar developers often suggest rooftop panels, but facilities directors face significant obstacles that parking lot canopies eliminate:</w:t>
+      </w:r>
+    </w:p>
+    <w:tbl>
+      <w:tblPr>
+        <w:tblW w:type="auto" w:w="0"/>
+        <w:jc w:val="center"/>
+        <w:tblLayout w:type="fixed"/>
+        <w:tblLook w:firstColumn="1" w:firstRow="1" w:lastColumn="0" w:lastRow="0" w:noHBand="0" w:noVBand="1" w:val="04A0"/>
+      </w:tblPr>
+      <w:tblGrid>
+        <w:gridCol w:w="3120"/>
+        <w:gridCol w:w="3120"/>
+        <w:gridCol w:w="3120"/>
+      </w:tblGrid>
+      <w:tr>
+        <w:tc>
+          <w:tcPr>
+            <w:tcW w:type="dxa" w:w="2160"/>
+            <w:shd w:fill="1E3A8A"/>
+            <w:tcMar>
+              <w:top w:w="120" w:type="dxa"/>
+              <w:bottom w:w="120" w:type="dxa"/>
+              <w:left w:w="140" w:type="dxa"/>
+              <w:right w:w="140" w:type="dxa"/>
+            </w:tcMar>
+          </w:tcPr>
+          <w:p>
+            <w:pPr>
+              <w:jc w:val="left"/>
+            </w:pPr>
+            <w:r>
+              <w:rPr>
+                <w:rFonts w:ascii="Calibri" w:hAnsi="Calibri"/>
+                <w:b/>
+                <w:color w:val="FFFFFF"/>
+                <w:sz w:val="20"/>
+              </w:rPr>
+              <w:t>Evaluation Metric</w:t>
+            </w:r>
+          </w:p>
+        </w:tc>
+        <w:tc>
+          <w:tcPr>
+            <w:tcW w:type="dxa" w:w="3312"/>
+            <w:shd w:fill="1E3A8A"/>
+            <w:tcMar>
+              <w:top w:w="120" w:type="dxa"/>
+              <w:bottom w:w="120" w:type="dxa"/>
+              <w:left w:w="140" w:type="dxa"/>
+              <w:right w:w="140" w:type="dxa"/>
+            </w:tcMar>
+          </w:tcPr>
+          <w:p>
+            <w:pPr>
+              <w:jc w:val="left"/>
+            </w:pPr>
+            <w:r>
+              <w:rPr>
+                <w:rFonts w:ascii="Calibri" w:hAnsi="Calibri"/>
+                <w:b/>
+                <w:color w:val="FFFFFF"/>
+                <w:sz w:val="20"/>
+              </w:rPr>
+              <w:t>Rooftop Solar</w:t>
+            </w:r>
+          </w:p>
+        </w:tc>
+        <w:tc>
+          <w:tcPr>
+            <w:tcW w:type="dxa" w:w="3888"/>
+            <w:shd w:fill="1E3A8A"/>
+            <w:tcMar>
+              <w:top w:w="120" w:type="dxa"/>
+              <w:bottom w:w="120" w:type="dxa"/>
+              <w:left w:w="140" w:type="dxa"/>
+              <w:right w:w="140" w:type="dxa"/>
+            </w:tcMar>
+          </w:tcPr>
+          <w:p>
+            <w:pPr>
+              <w:jc w:val="left"/>
+            </w:pPr>
+            <w:r>
+              <w:rPr>
+                <w:rFonts w:ascii="Calibri" w:hAnsi="Calibri"/>
+                <w:b/>
+                <w:color w:val="FFFFFF"/>
+                <w:sz w:val="20"/>
+              </w:rPr>
+              <w:t>Parking Lot Canopy (SolarSchools USA)</w:t>
+            </w:r>
+          </w:p>
+        </w:tc>
+      </w:tr>
+      <w:tr>
+        <w:tc>
+          <w:tcPr>
+            <w:tcW w:type="dxa" w:w="2160"/>
+            <w:shd w:fill="FFFFFF"/>
+            <w:tcMar>
+              <w:top w:w="90" w:type="dxa"/>
+              <w:bottom w:w="90" w:type="dxa"/>
+              <w:left w:w="140" w:type="dxa"/>
+              <w:right w:w="140" w:type="dxa"/>
+            </w:tcMar>
+          </w:tcPr>
+          <w:p>
+            <w:r>
+              <w:rPr>
+                <w:rFonts w:ascii="Calibri" w:hAnsi="Calibri"/>
+                <w:color w:val="1E293B"/>
+                <w:sz w:val="19"/>
+              </w:rPr>
+              <w:t>Roof Warranty</w:t>
+            </w:r>
+          </w:p>
+        </w:tc>
+        <w:tc>
+          <w:tcPr>
+            <w:tcW w:type="dxa" w:w="3312"/>
+            <w:shd w:fill="FFFFFF"/>
+            <w:tcMar>
+              <w:top w:w="90" w:type="dxa"/>
+              <w:bottom w:w="90" w:type="dxa"/>
+              <w:left w:w="140" w:type="dxa"/>
+              <w:right w:w="140" w:type="dxa"/>
+            </w:tcMar>
+          </w:tcPr>
+          <w:p>
+            <w:r>
+              <w:rPr>
+                <w:rFonts w:ascii="Calibri" w:hAnsi="Calibri"/>
+                <w:color w:val="1E293B"/>
+                <w:sz w:val="19"/>
+              </w:rPr>
+              <w:t>Risk of voiding 20-year membrane warranty</w:t>
+            </w:r>
+          </w:p>
+        </w:tc>
+        <w:tc>
+          <w:tcPr>
+            <w:tcW w:type="dxa" w:w="3888"/>
+            <w:shd w:fill="FFFFFF"/>
+            <w:tcMar>
+              <w:top w:w="90" w:type="dxa"/>
+              <w:bottom w:w="90" w:type="dxa"/>
+              <w:left w:w="140" w:type="dxa"/>
+              <w:right w:w="140" w:type="dxa"/>
+            </w:tcMar>
+          </w:tcPr>
+          <w:p>
+            <w:r>
+              <w:rPr>
+                <w:rFonts w:ascii="Calibri" w:hAnsi="Calibri"/>
+                <w:color w:val="1E293B"/>
+                <w:sz w:val="19"/>
+              </w:rPr>
+              <w:t>Zero roof penetrations; independent structural steel</w:t>
+            </w:r>
+          </w:p>
+        </w:tc>
+      </w:tr>
+      <w:tr>
+        <w:tc>
+          <w:tcPr>
+            <w:tcW w:type="dxa" w:w="2160"/>
+            <w:shd w:fill="F8FAFC"/>
+            <w:tcMar>
+              <w:top w:w="90" w:type="dxa"/>
+              <w:bottom w:w="90" w:type="dxa"/>
+              <w:left w:w="140" w:type="dxa"/>
+              <w:right w:w="140" w:type="dxa"/>
+            </w:tcMar>
+          </w:tcPr>
+          <w:p>
+            <w:r>
+              <w:rPr>
+                <w:rFonts w:ascii="Calibri" w:hAnsi="Calibri"/>
+                <w:color w:val="1E293B"/>
+                <w:sz w:val="19"/>
+              </w:rPr>
+              <w:t>Structural Capacity</w:t>
+            </w:r>
+          </w:p>
+        </w:tc>
+        <w:tc>
+          <w:tcPr>
+            <w:tcW w:type="dxa" w:w="3312"/>
+            <w:shd w:fill="F8FAFC"/>
+            <w:tcMar>
+              <w:top w:w="90" w:type="dxa"/>
+              <w:bottom w:w="90" w:type="dxa"/>
+              <w:left w:w="140" w:type="dxa"/>
+              <w:right w:w="140" w:type="dxa"/>
+            </w:tcMar>
+          </w:tcPr>
+          <w:p>
+            <w:r>
+              <w:rPr>
+                <w:rFonts w:ascii="Calibri" w:hAnsi="Calibri"/>
+                <w:color w:val="1E293B"/>
+                <w:sz w:val="19"/>
+              </w:rPr>
+              <w:t>Limited by HVAC weight and seismic ratings</w:t>
+            </w:r>
+          </w:p>
+        </w:tc>
+        <w:tc>
+          <w:tcPr>
+            <w:tcW w:type="dxa" w:w="3888"/>
+            <w:shd w:fill="F8FAFC"/>
+            <w:tcMar>
+              <w:top w:w="90" w:type="dxa"/>
+              <w:bottom w:w="90" w:type="dxa"/>
+              <w:left w:w="140" w:type="dxa"/>
+              <w:right w:w="140" w:type="dxa"/>
+            </w:tcMar>
+          </w:tcPr>
+          <w:p>
+            <w:r>
+              <w:rPr>
+                <w:rFonts w:ascii="Calibri" w:hAnsi="Calibri"/>
+                <w:color w:val="1E293B"/>
+                <w:sz w:val="19"/>
+              </w:rPr>
+              <w:t>Engineered independent pier foundations</w:t>
+            </w:r>
+          </w:p>
+        </w:tc>
+      </w:tr>
+      <w:tr>
+        <w:tc>
+          <w:tcPr>
+            <w:tcW w:type="dxa" w:w="2160"/>
+            <w:shd w:fill="FFFFFF"/>
+            <w:tcMar>
+              <w:top w:w="90" w:type="dxa"/>
+              <w:bottom w:w="90" w:type="dxa"/>
+              <w:left w:w="140" w:type="dxa"/>
+              <w:right w:w="140" w:type="dxa"/>
+            </w:tcMar>
+          </w:tcPr>
+          <w:p>
+            <w:r>
+              <w:rPr>
+                <w:rFonts w:ascii="Calibri" w:hAnsi="Calibri"/>
+                <w:color w:val="1E293B"/>
+                <w:sz w:val="19"/>
+              </w:rPr>
+              <w:t>Microclimate Impact</w:t>
+            </w:r>
+          </w:p>
+        </w:tc>
+        <w:tc>
+          <w:tcPr>
+            <w:tcW w:type="dxa" w:w="3312"/>
+            <w:shd w:fill="FFFFFF"/>
+            <w:tcMar>
+              <w:top w:w="90" w:type="dxa"/>
+              <w:bottom w:w="90" w:type="dxa"/>
+              <w:left w:w="140" w:type="dxa"/>
+              <w:right w:w="140" w:type="dxa"/>
+            </w:tcMar>
+          </w:tcPr>
+          <w:p>
+            <w:r>
+              <w:rPr>
+                <w:rFonts w:ascii="Calibri" w:hAnsi="Calibri"/>
+                <w:color w:val="1E293B"/>
+                <w:sz w:val="19"/>
+              </w:rPr>
+              <w:t>Minor roof cooling</w:t>
+            </w:r>
+          </w:p>
+        </w:tc>
+        <w:tc>
+          <w:tcPr>
+            <w:tcW w:type="dxa" w:w="3888"/>
+            <w:shd w:fill="FFFFFF"/>
+            <w:tcMar>
+              <w:top w:w="90" w:type="dxa"/>
+              <w:bottom w:w="90" w:type="dxa"/>
+              <w:left w:w="140" w:type="dxa"/>
+              <w:right w:w="140" w:type="dxa"/>
+            </w:tcMar>
+          </w:tcPr>
+          <w:p>
+            <w:r>
+              <w:rPr>
+                <w:rFonts w:ascii="Calibri" w:hAnsi="Calibri"/>
+                <w:color w:val="1E293B"/>
+                <w:sz w:val="19"/>
+              </w:rPr>
+              <w:t>Drops asphalt surface temp by 30°F to 45°F</w:t>
+            </w:r>
+          </w:p>
+        </w:tc>
+      </w:tr>
+      <w:tr>
+        <w:tc>
+          <w:tcPr>
+            <w:tcW w:type="dxa" w:w="2160"/>
+            <w:shd w:fill="F8FAFC"/>
+            <w:tcMar>
+              <w:top w:w="90" w:type="dxa"/>
+              <w:bottom w:w="90" w:type="dxa"/>
+              <w:left w:w="140" w:type="dxa"/>
+              <w:right w:w="140" w:type="dxa"/>
+            </w:tcMar>
+          </w:tcPr>
+          <w:p>
+            <w:r>
+              <w:rPr>
+                <w:rFonts w:ascii="Calibri" w:hAnsi="Calibri"/>
+                <w:color w:val="1E293B"/>
+                <w:sz w:val="19"/>
+              </w:rPr>
+              <w:t>EV Integration</w:t>
+            </w:r>
+          </w:p>
+        </w:tc>
+        <w:tc>
+          <w:tcPr>
+            <w:tcW w:type="dxa" w:w="3312"/>
+            <w:shd w:fill="F8FAFC"/>
+            <w:tcMar>
+              <w:top w:w="90" w:type="dxa"/>
+              <w:bottom w:w="90" w:type="dxa"/>
+              <w:left w:w="140" w:type="dxa"/>
+              <w:right w:w="140" w:type="dxa"/>
+            </w:tcMar>
+          </w:tcPr>
+          <w:p>
+            <w:r>
+              <w:rPr>
+                <w:rFonts w:ascii="Calibri" w:hAnsi="Calibri"/>
+                <w:color w:val="1E293B"/>
+                <w:sz w:val="19"/>
+              </w:rPr>
+              <w:t>Requires expensive trenching to ground lot</w:t>
+            </w:r>
+          </w:p>
+        </w:tc>
+        <w:tc>
+          <w:tcPr>
+            <w:tcW w:type="dxa" w:w="3888"/>
+            <w:shd w:fill="F8FAFC"/>
+            <w:tcMar>
+              <w:top w:w="90" w:type="dxa"/>
+              <w:bottom w:w="90" w:type="dxa"/>
+              <w:left w:w="140" w:type="dxa"/>
+              <w:right w:w="140" w:type="dxa"/>
+            </w:tcMar>
+          </w:tcPr>
+          <w:p>
+            <w:r>
+              <w:rPr>
+                <w:rFonts w:ascii="Calibri" w:hAnsi="Calibri"/>
+                <w:color w:val="1E293B"/>
+                <w:sz w:val="19"/>
+              </w:rPr>
+              <w:t>Turnkey conduit integration for Level 2 EV chargers</w:t>
+            </w:r>
+          </w:p>
+        </w:tc>
+      </w:tr>
+      <w:tr>
+        <w:tc>
+          <w:tcPr>
+            <w:tcW w:type="dxa" w:w="2160"/>
+            <w:shd w:fill="FFFFFF"/>
+            <w:tcMar>
+              <w:top w:w="90" w:type="dxa"/>
+              <w:bottom w:w="90" w:type="dxa"/>
+              <w:left w:w="140" w:type="dxa"/>
+              <w:right w:w="140" w:type="dxa"/>
+            </w:tcMar>
+          </w:tcPr>
+          <w:p>
+            <w:r>
+              <w:rPr>
+                <w:rFonts w:ascii="Calibri" w:hAnsi="Calibri"/>
+                <w:color w:val="1E293B"/>
+                <w:sz w:val="19"/>
+              </w:rPr>
+              <w:t>Campus Visibility</w:t>
+            </w:r>
+          </w:p>
+        </w:tc>
+        <w:tc>
+          <w:tcPr>
+            <w:tcW w:type="dxa" w:w="3312"/>
+            <w:shd w:fill="FFFFFF"/>
+            <w:tcMar>
+              <w:top w:w="90" w:type="dxa"/>
+              <w:bottom w:w="90" w:type="dxa"/>
+              <w:left w:w="140" w:type="dxa"/>
+              <w:right w:w="140" w:type="dxa"/>
+            </w:tcMar>
+          </w:tcPr>
+          <w:p>
+            <w:r>
+              <w:rPr>
+                <w:rFonts w:ascii="Calibri" w:hAnsi="Calibri"/>
+                <w:color w:val="1E293B"/>
+                <w:sz w:val="19"/>
+              </w:rPr>
+              <w:t>Hidden from student and community view</w:t>
+            </w:r>
+          </w:p>
+        </w:tc>
+        <w:tc>
+          <w:tcPr>
+            <w:tcW w:type="dxa" w:w="3888"/>
+            <w:shd w:fill="FFFFFF"/>
+            <w:tcMar>
+              <w:top w:w="90" w:type="dxa"/>
+              <w:bottom w:w="90" w:type="dxa"/>
+              <w:left w:w="140" w:type="dxa"/>
+              <w:right w:w="140" w:type="dxa"/>
+            </w:tcMar>
+          </w:tcPr>
+          <w:p>
+            <w:r>
+              <w:rPr>
+                <w:rFonts w:ascii="Calibri" w:hAnsi="Calibri"/>
+                <w:color w:val="1E293B"/>
+                <w:sz w:val="19"/>
+              </w:rPr>
+              <w:t>Highly visible showcase of civic climate leadership</w:t>
             </w:r>
           </w:p>
         </w:tc>

</xml_diff>